<commit_message>
docs: :memo: review reports
</commit_message>
<xml_diff>
--- a/reports/C2/Group/CHARTERING REPORT.docx
+++ b/reports/C2/Group/CHARTERING REPORT.docx
@@ -43,6 +43,7 @@
         <w:rPr>
           <w:rStyle w:val="s1"/>
           <w:rFonts w:eastAsiaTheme="majorEastAsia"/>
+          <w:noProof/>
           <w:sz w:val="44"/>
           <w:szCs w:val="44"/>
           <w:lang w:val="en-US"/>
@@ -103,7 +104,6 @@
         <w:rPr>
           <w:sz w:val="20"/>
           <w:szCs w:val="20"/>
-          <w:lang w:val="en-US"/>
         </w:rPr>
       </w:pPr>
       <w:r>
@@ -124,12 +124,23 @@
           <w:szCs w:val="20"/>
           <w:lang w:val="en-US"/>
         </w:rPr>
-        <w:t>: https://github.com/marrivbec/gii-is-DP2-C1.033</w:t>
-      </w:r>
-    </w:p>
-    <w:p>
-      <w:pPr>
-        <w:pStyle w:val="p2"/>
+        <w:t xml:space="preserve">: </w:t>
+      </w:r>
+      <w:hyperlink r:id="rId6" w:history="1">
+        <w:r>
+          <w:rPr>
+            <w:rStyle w:val="Hyperlink"/>
+            <w:sz w:val="20"/>
+            <w:szCs w:val="20"/>
+            <w:lang w:val="en-GB"/>
+          </w:rPr>
+          <w:t>https://github.com/marrivbec/gii-is-DP2-C2.033</w:t>
+        </w:r>
+      </w:hyperlink>
+    </w:p>
+    <w:p>
+      <w:pPr>
+        <w:pStyle w:val="p1"/>
         <w:rPr>
           <w:sz w:val="20"/>
           <w:szCs w:val="20"/>
@@ -174,7 +185,7 @@
           <w:sz w:val="20"/>
           <w:szCs w:val="20"/>
         </w:rPr>
-        <w:t>Jesús Villalba Fernández – jesvilfer@alum.us.es</w:t>
+        <w:t>Mario Rivas Becerra – marrivbec1@alum.us.es</w:t>
       </w:r>
     </w:p>
     <w:p>
@@ -194,7 +205,7 @@
           <w:sz w:val="20"/>
           <w:szCs w:val="20"/>
         </w:rPr>
-        <w:t>Juan Ramírez Morales – juarammor2@alum.us.es</w:t>
+        <w:t>Álvaro Baladrón Caballero – alvbalcab@alum.us.es</w:t>
       </w:r>
     </w:p>
     <w:p>
@@ -214,60 +225,6 @@
           <w:sz w:val="20"/>
           <w:szCs w:val="20"/>
         </w:rPr>
-        <w:t>Mario Rivas Becerra – marrivbec1@alum.us.es</w:t>
-      </w:r>
-    </w:p>
-    <w:p>
-      <w:pPr>
-        <w:pStyle w:val="p1"/>
-        <w:numPr>
-          <w:ilvl w:val="0"/>
-          <w:numId w:val="6"/>
-        </w:numPr>
-        <w:rPr>
-          <w:sz w:val="20"/>
-          <w:szCs w:val="20"/>
-        </w:rPr>
-      </w:pPr>
-      <w:r>
-        <w:rPr>
-          <w:sz w:val="20"/>
-          <w:szCs w:val="20"/>
-        </w:rPr>
-        <w:t xml:space="preserve">Álvaro Baladrón Caballero – </w:t>
-      </w:r>
-      <w:r>
-        <w:rPr>
-          <w:sz w:val="20"/>
-          <w:szCs w:val="20"/>
-        </w:rPr>
-        <w:t>alvbalcab</w:t>
-      </w:r>
-      <w:r>
-        <w:rPr>
-          <w:sz w:val="20"/>
-          <w:szCs w:val="20"/>
-        </w:rPr>
-        <w:t>@alum.us.es</w:t>
-      </w:r>
-    </w:p>
-    <w:p>
-      <w:pPr>
-        <w:pStyle w:val="p1"/>
-        <w:numPr>
-          <w:ilvl w:val="0"/>
-          <w:numId w:val="6"/>
-        </w:numPr>
-        <w:rPr>
-          <w:sz w:val="20"/>
-          <w:szCs w:val="20"/>
-        </w:rPr>
-      </w:pPr>
-      <w:r>
-        <w:rPr>
-          <w:sz w:val="20"/>
-          <w:szCs w:val="20"/>
-        </w:rPr>
         <w:t>Ángel Manuel Ferrer Álvarez – angferalv@alum.us.es</w:t>
       </w:r>
     </w:p>
@@ -307,7 +264,39 @@
           <w:szCs w:val="20"/>
           <w:lang w:val="en-US"/>
         </w:rPr>
-        <w:t>: February 19, 2025</w:t>
+        <w:t xml:space="preserve">: </w:t>
+      </w:r>
+      <w:r>
+        <w:rPr>
+          <w:sz w:val="20"/>
+          <w:szCs w:val="20"/>
+          <w:lang w:val="en-US"/>
+        </w:rPr>
+        <w:t>July</w:t>
+      </w:r>
+      <w:r>
+        <w:rPr>
+          <w:sz w:val="20"/>
+          <w:szCs w:val="20"/>
+          <w:lang w:val="en-US"/>
+        </w:rPr>
+        <w:t xml:space="preserve"> </w:t>
+      </w:r>
+      <w:r>
+        <w:rPr>
+          <w:sz w:val="20"/>
+          <w:szCs w:val="20"/>
+          <w:lang w:val="en-US"/>
+        </w:rPr>
+        <w:t>1</w:t>
+      </w:r>
+      <w:r>
+        <w:rPr>
+          <w:sz w:val="20"/>
+          <w:szCs w:val="20"/>
+          <w:lang w:val="en-US"/>
+        </w:rPr>
+        <w:t>, 2025</w:t>
       </w:r>
     </w:p>
     <w:p>
@@ -510,7 +499,6 @@
           <w:lang w:val="en-US"/>
         </w:rPr>
       </w:pPr>
-      <w:proofErr w:type="gramStart"/>
       <w:r>
         <w:rPr>
           <w:sz w:val="20"/>
@@ -525,9 +513,8 @@
           <w:szCs w:val="20"/>
           <w:lang w:val="en-US"/>
         </w:rPr>
-        <w:t>Executive</w:t>
-      </w:r>
-      <w:proofErr w:type="gramEnd"/>
+        <w:t xml:space="preserve">Executive </w:t>
+      </w:r>
       <w:r>
         <w:rPr>
           <w:sz w:val="20"/>
@@ -542,6 +529,64 @@
           <w:szCs w:val="20"/>
           <w:lang w:val="en-US"/>
         </w:rPr>
+        <w:t xml:space="preserve">summary </w:t>
+      </w:r>
+      <w:r>
+        <w:rPr>
+          <w:sz w:val="20"/>
+          <w:szCs w:val="20"/>
+          <w:lang w:val="en-US"/>
+        </w:rPr>
+        <w:t>--------</w:t>
+      </w:r>
+      <w:r>
+        <w:rPr>
+          <w:sz w:val="20"/>
+          <w:szCs w:val="20"/>
+          <w:lang w:val="en-US"/>
+        </w:rPr>
+        <w:t>--------</w:t>
+      </w:r>
+      <w:r>
+        <w:rPr>
+          <w:sz w:val="20"/>
+          <w:szCs w:val="20"/>
+          <w:lang w:val="en-US"/>
+        </w:rPr>
+        <w:t>-------------------------------------------------------------------3</w:t>
+      </w:r>
+    </w:p>
+    <w:p>
+      <w:pPr>
+        <w:spacing w:before="240" w:after="240"/>
+        <w:rPr>
+          <w:sz w:val="20"/>
+          <w:szCs w:val="20"/>
+          <w:lang w:val="en-US"/>
+        </w:rPr>
+      </w:pPr>
+      <w:r>
+        <w:rPr>
+          <w:sz w:val="20"/>
+          <w:szCs w:val="20"/>
+          <w:lang w:val="en-US"/>
+        </w:rPr>
+        <w:t xml:space="preserve">2  </w:t>
+      </w:r>
+      <w:r>
+        <w:rPr>
+          <w:sz w:val="20"/>
+          <w:szCs w:val="20"/>
+          <w:lang w:val="en-US"/>
+        </w:rPr>
+        <w:t>Revision Table</w:t>
+      </w:r>
+      <w:r>
+        <w:rPr>
+          <w:sz w:val="20"/>
+          <w:szCs w:val="20"/>
+          <w:lang w:val="en-US"/>
+        </w:rPr>
         <w:t xml:space="preserve"> </w:t>
       </w:r>
       <w:r>
@@ -550,7 +595,57 @@
           <w:szCs w:val="20"/>
           <w:lang w:val="en-US"/>
         </w:rPr>
-        <w:t xml:space="preserve">summary </w:t>
+        <w:t>---------------</w:t>
+      </w:r>
+      <w:r>
+        <w:rPr>
+          <w:sz w:val="20"/>
+          <w:szCs w:val="20"/>
+          <w:lang w:val="en-US"/>
+        </w:rPr>
+        <w:t>----------------------------------------------------------------------------3</w:t>
+      </w:r>
+    </w:p>
+    <w:p>
+      <w:pPr>
+        <w:spacing w:before="240" w:after="240"/>
+        <w:rPr>
+          <w:sz w:val="20"/>
+          <w:szCs w:val="20"/>
+          <w:lang w:val="en-US"/>
+        </w:rPr>
+      </w:pPr>
+      <w:r>
+        <w:rPr>
+          <w:sz w:val="20"/>
+          <w:szCs w:val="20"/>
+          <w:lang w:val="en-US"/>
+        </w:rPr>
+        <w:t xml:space="preserve">3 </w:t>
+      </w:r>
+      <w:r>
+        <w:rPr>
+          <w:sz w:val="20"/>
+          <w:szCs w:val="20"/>
+          <w:lang w:val="en-US"/>
+        </w:rPr>
+        <w:t>Introduc</w:t>
+      </w:r>
+      <w:r>
+        <w:rPr>
+          <w:sz w:val="20"/>
+          <w:szCs w:val="20"/>
+          <w:lang w:val="en-US"/>
+        </w:rPr>
+        <w:t xml:space="preserve">tion </w:t>
+      </w:r>
+      <w:r>
+        <w:rPr>
+          <w:sz w:val="20"/>
+          <w:szCs w:val="20"/>
+          <w:lang w:val="en-US"/>
+        </w:rPr>
+        <w:t xml:space="preserve"> </w:t>
       </w:r>
       <w:r>
         <w:rPr>
@@ -566,21 +661,377 @@
           <w:szCs w:val="20"/>
           <w:lang w:val="en-US"/>
         </w:rPr>
-        <w:t>--------</w:t>
-      </w:r>
-      <w:r>
-        <w:rPr>
-          <w:sz w:val="20"/>
-          <w:szCs w:val="20"/>
-          <w:lang w:val="en-US"/>
-        </w:rPr>
-        <w:t>------------------------------------------------------</w:t>
-      </w:r>
-      <w:r>
-        <w:rPr>
-          <w:sz w:val="20"/>
-          <w:szCs w:val="20"/>
-          <w:lang w:val="en-US"/>
+        <w:t>-------------------------------------------------------------------------</w:t>
+      </w:r>
+      <w:r>
+        <w:rPr>
+          <w:sz w:val="20"/>
+          <w:szCs w:val="20"/>
+          <w:lang w:val="en-US"/>
+        </w:rPr>
+        <w:t>-------------3</w:t>
+      </w:r>
+    </w:p>
+    <w:p>
+      <w:pPr>
+        <w:spacing w:before="240" w:after="240"/>
+        <w:rPr>
+          <w:sz w:val="20"/>
+          <w:szCs w:val="20"/>
+          <w:lang w:val="en-US"/>
+        </w:rPr>
+      </w:pPr>
+      <w:r>
+        <w:rPr>
+          <w:sz w:val="20"/>
+          <w:szCs w:val="20"/>
+          <w:lang w:val="en-US"/>
+        </w:rPr>
+        <w:t xml:space="preserve">4 </w:t>
+      </w:r>
+      <w:r>
+        <w:rPr>
+          <w:sz w:val="20"/>
+          <w:szCs w:val="20"/>
+          <w:lang w:val="en-US"/>
+        </w:rPr>
+        <w:t xml:space="preserve">Summary </w:t>
+      </w:r>
+      <w:r>
+        <w:rPr>
+          <w:sz w:val="20"/>
+          <w:szCs w:val="20"/>
+          <w:lang w:val="en-US"/>
+        </w:rPr>
+        <w:t>------</w:t>
+      </w:r>
+      <w:r>
+        <w:rPr>
+          <w:sz w:val="20"/>
+          <w:szCs w:val="20"/>
+          <w:lang w:val="en-US"/>
+        </w:rPr>
+        <w:t>--------------------------------------------------------------------------------------</w:t>
+      </w:r>
+      <w:r>
+        <w:rPr>
+          <w:sz w:val="20"/>
+          <w:szCs w:val="20"/>
+          <w:lang w:val="en-US"/>
+        </w:rPr>
+        <w:t>--</w:t>
+      </w:r>
+      <w:r>
+        <w:rPr>
+          <w:sz w:val="20"/>
+          <w:szCs w:val="20"/>
+          <w:lang w:val="en-US"/>
+        </w:rPr>
+        <w:t>-----</w:t>
+      </w:r>
+      <w:r>
+        <w:rPr>
+          <w:sz w:val="20"/>
+          <w:szCs w:val="20"/>
+          <w:lang w:val="en-US"/>
+        </w:rPr>
+        <w:t>4</w:t>
+      </w:r>
+    </w:p>
+    <w:p>
+      <w:pPr>
+        <w:spacing w:before="240" w:after="240"/>
+        <w:rPr>
+          <w:sz w:val="20"/>
+          <w:szCs w:val="20"/>
+          <w:lang w:val="en-US"/>
+        </w:rPr>
+      </w:pPr>
+      <w:r>
+        <w:rPr>
+          <w:sz w:val="20"/>
+          <w:szCs w:val="20"/>
+          <w:lang w:val="en-US"/>
+        </w:rPr>
+        <w:t xml:space="preserve">5 </w:t>
+      </w:r>
+      <w:r>
+        <w:rPr>
+          <w:sz w:val="20"/>
+          <w:szCs w:val="20"/>
+          <w:lang w:val="en-US"/>
+        </w:rPr>
+        <w:t>Wo</w:t>
+      </w:r>
+      <w:r>
+        <w:rPr>
+          <w:sz w:val="20"/>
+          <w:szCs w:val="20"/>
+          <w:lang w:val="en-US"/>
+        </w:rPr>
+        <w:t>rking group members</w:t>
+      </w:r>
+      <w:r>
+        <w:rPr>
+          <w:sz w:val="20"/>
+          <w:szCs w:val="20"/>
+          <w:lang w:val="en-US"/>
+        </w:rPr>
+        <w:t xml:space="preserve"> </w:t>
+      </w:r>
+      <w:r>
+        <w:rPr>
+          <w:sz w:val="20"/>
+          <w:szCs w:val="20"/>
+          <w:lang w:val="en-US"/>
+        </w:rPr>
+        <w:t>-----</w:t>
+      </w:r>
+      <w:r>
+        <w:rPr>
+          <w:sz w:val="20"/>
+          <w:szCs w:val="20"/>
+          <w:lang w:val="en-US"/>
+        </w:rPr>
+        <w:t>--------------------------------------------------------------------------</w:t>
+      </w:r>
+      <w:r>
+        <w:rPr>
+          <w:sz w:val="20"/>
+          <w:szCs w:val="20"/>
+          <w:lang w:val="en-US"/>
+        </w:rPr>
+        <w:t>-</w:t>
+      </w:r>
+      <w:r>
+        <w:rPr>
+          <w:sz w:val="20"/>
+          <w:szCs w:val="20"/>
+          <w:lang w:val="en-US"/>
+        </w:rPr>
+        <w:t>4</w:t>
+      </w:r>
+    </w:p>
+    <w:p>
+      <w:pPr>
+        <w:spacing w:before="240" w:after="240"/>
+        <w:rPr>
+          <w:sz w:val="20"/>
+          <w:szCs w:val="20"/>
+          <w:lang w:val="en-US"/>
+        </w:rPr>
+      </w:pPr>
+      <w:r>
+        <w:rPr>
+          <w:sz w:val="20"/>
+          <w:szCs w:val="20"/>
+          <w:lang w:val="en-US"/>
+        </w:rPr>
+        <w:t xml:space="preserve">6 </w:t>
+      </w:r>
+      <w:r>
+        <w:rPr>
+          <w:sz w:val="20"/>
+          <w:szCs w:val="20"/>
+          <w:lang w:val="en-US"/>
+        </w:rPr>
+        <w:t>Commitment Statement</w:t>
+      </w:r>
+      <w:r>
+        <w:rPr>
+          <w:sz w:val="20"/>
+          <w:szCs w:val="20"/>
+          <w:lang w:val="en-US"/>
+        </w:rPr>
+        <w:t xml:space="preserve"> ----------------------------------------------</w:t>
+      </w:r>
+      <w:r>
+        <w:rPr>
+          <w:sz w:val="20"/>
+          <w:szCs w:val="20"/>
+          <w:lang w:val="en-US"/>
+        </w:rPr>
+        <w:t>----------------------------</w:t>
+      </w:r>
+      <w:r>
+        <w:rPr>
+          <w:sz w:val="20"/>
+          <w:szCs w:val="20"/>
+          <w:lang w:val="en-US"/>
+        </w:rPr>
+        <w:t>-</w:t>
+      </w:r>
+      <w:r>
+        <w:rPr>
+          <w:sz w:val="20"/>
+          <w:szCs w:val="20"/>
+          <w:lang w:val="en-US"/>
+        </w:rPr>
+        <w:t>---</w:t>
+      </w:r>
+      <w:r>
+        <w:rPr>
+          <w:sz w:val="20"/>
+          <w:szCs w:val="20"/>
+          <w:lang w:val="en-US"/>
+        </w:rPr>
+        <w:t>-</w:t>
+      </w:r>
+      <w:r>
+        <w:rPr>
+          <w:sz w:val="20"/>
+          <w:szCs w:val="20"/>
+          <w:lang w:val="en-US"/>
+        </w:rPr>
+        <w:t xml:space="preserve">  </w:t>
+      </w:r>
+      <w:r>
+        <w:rPr>
+          <w:sz w:val="20"/>
+          <w:szCs w:val="20"/>
+          <w:lang w:val="en-US"/>
+        </w:rPr>
+        <w:t>5</w:t>
+      </w:r>
+    </w:p>
+    <w:p>
+      <w:pPr>
+        <w:spacing w:before="240" w:after="240"/>
+        <w:rPr>
+          <w:sz w:val="20"/>
+          <w:szCs w:val="20"/>
+          <w:lang w:val="en-GB"/>
+        </w:rPr>
+      </w:pPr>
+      <w:r>
+        <w:rPr>
+          <w:sz w:val="20"/>
+          <w:szCs w:val="20"/>
+          <w:lang w:val="en-GB"/>
+        </w:rPr>
+        <w:t xml:space="preserve">7 </w:t>
+      </w:r>
+      <w:r>
+        <w:rPr>
+          <w:sz w:val="20"/>
+          <w:szCs w:val="20"/>
+          <w:lang w:val="en-GB"/>
+        </w:rPr>
+        <w:t>Performance Indicators-- --------------------------------------------------------------------------</w:t>
+      </w:r>
+      <w:r>
+        <w:rPr>
+          <w:sz w:val="20"/>
+          <w:szCs w:val="20"/>
+          <w:lang w:val="en-GB"/>
+        </w:rPr>
+        <w:t>----- 6</w:t>
+      </w:r>
+    </w:p>
+    <w:p>
+      <w:pPr>
+        <w:spacing w:before="240" w:after="240"/>
+        <w:rPr>
+          <w:sz w:val="20"/>
+          <w:szCs w:val="20"/>
+          <w:lang w:val="en-GB"/>
+        </w:rPr>
+      </w:pPr>
+      <w:r>
+        <w:rPr>
+          <w:sz w:val="20"/>
+          <w:szCs w:val="20"/>
+          <w:lang w:val="en-GB"/>
+        </w:rPr>
+        <w:t>8</w:t>
+      </w:r>
+      <w:r>
+        <w:rPr>
+          <w:sz w:val="20"/>
+          <w:szCs w:val="20"/>
+          <w:lang w:val="en-GB"/>
+        </w:rPr>
+        <w:t xml:space="preserve"> </w:t>
+      </w:r>
+      <w:r>
+        <w:rPr>
+          <w:sz w:val="20"/>
+          <w:szCs w:val="20"/>
+          <w:lang w:val="en-GB"/>
+        </w:rPr>
+        <w:t>Reward System ---------------------------------------</w:t>
+      </w:r>
+      <w:r>
+        <w:rPr>
+          <w:sz w:val="20"/>
+          <w:szCs w:val="20"/>
+          <w:lang w:val="en-GB"/>
+        </w:rPr>
+        <w:t xml:space="preserve">---------------------------------------------------- </w:t>
+      </w:r>
+      <w:r>
+        <w:rPr>
+          <w:sz w:val="20"/>
+          <w:szCs w:val="20"/>
+          <w:lang w:val="en-GB"/>
+        </w:rPr>
+        <w:t>6</w:t>
+      </w:r>
+    </w:p>
+    <w:p>
+      <w:pPr>
+        <w:spacing w:before="240" w:after="240"/>
+        <w:rPr>
+          <w:sz w:val="20"/>
+          <w:szCs w:val="20"/>
+          <w:lang w:val="en-GB"/>
+        </w:rPr>
+      </w:pPr>
+      <w:r>
+        <w:rPr>
+          <w:sz w:val="20"/>
+          <w:szCs w:val="20"/>
+          <w:lang w:val="en-GB"/>
+        </w:rPr>
+        <w:t>9</w:t>
+      </w:r>
+      <w:r>
+        <w:rPr>
+          <w:sz w:val="20"/>
+          <w:szCs w:val="20"/>
+          <w:lang w:val="en-GB"/>
+        </w:rPr>
+        <w:t xml:space="preserve"> </w:t>
+      </w:r>
+      <w:r>
+        <w:rPr>
+          <w:sz w:val="20"/>
+          <w:szCs w:val="20"/>
+          <w:lang w:val="en-GB"/>
+        </w:rPr>
+        <w:t>Sanction System</w:t>
+      </w:r>
+      <w:r>
+        <w:rPr>
+          <w:sz w:val="20"/>
+          <w:szCs w:val="20"/>
+          <w:lang w:val="en-GB"/>
+        </w:rPr>
+        <w:t xml:space="preserve"> </w:t>
+      </w:r>
+      <w:r>
+        <w:rPr>
+          <w:sz w:val="20"/>
+          <w:szCs w:val="20"/>
+          <w:lang w:val="en-GB"/>
+        </w:rPr>
+        <w:t>---------------------------------------------------------------------------</w:t>
+      </w:r>
+      <w:r>
+        <w:rPr>
+          <w:sz w:val="20"/>
+          <w:szCs w:val="20"/>
+          <w:lang w:val="en-GB"/>
         </w:rPr>
         <w:t>-------------</w:t>
       </w:r>
@@ -588,9 +1039,17 @@
         <w:rPr>
           <w:sz w:val="20"/>
           <w:szCs w:val="20"/>
-          <w:lang w:val="en-US"/>
-        </w:rPr>
-        <w:t>3</w:t>
+          <w:lang w:val="en-GB"/>
+        </w:rPr>
+        <w:t>--</w:t>
+      </w:r>
+      <w:r>
+        <w:rPr>
+          <w:sz w:val="20"/>
+          <w:szCs w:val="20"/>
+          <w:lang w:val="en-GB"/>
+        </w:rPr>
+        <w:t xml:space="preserve"> 6</w:t>
       </w:r>
     </w:p>
     <w:p>
@@ -599,40 +1058,22 @@
         <w:rPr>
           <w:sz w:val="20"/>
           <w:szCs w:val="20"/>
-          <w:lang w:val="en-US"/>
-        </w:rPr>
-      </w:pPr>
-      <w:proofErr w:type="gramStart"/>
-      <w:r>
-        <w:rPr>
-          <w:sz w:val="20"/>
-          <w:szCs w:val="20"/>
-          <w:lang w:val="en-US"/>
-        </w:rPr>
-        <w:t xml:space="preserve">2  </w:t>
-      </w:r>
-      <w:r>
-        <w:rPr>
-          <w:sz w:val="20"/>
-          <w:szCs w:val="20"/>
-          <w:lang w:val="en-US"/>
-        </w:rPr>
-        <w:t>Revision</w:t>
-      </w:r>
-      <w:proofErr w:type="gramEnd"/>
-      <w:r>
-        <w:rPr>
-          <w:sz w:val="20"/>
-          <w:szCs w:val="20"/>
-          <w:lang w:val="en-US"/>
-        </w:rPr>
-        <w:t xml:space="preserve"> Table</w:t>
-      </w:r>
-      <w:r>
-        <w:rPr>
-          <w:sz w:val="20"/>
-          <w:szCs w:val="20"/>
-          <w:lang w:val="en-US"/>
+          <w:lang w:val="en-GB"/>
+        </w:rPr>
+      </w:pPr>
+      <w:r>
+        <w:rPr>
+          <w:sz w:val="20"/>
+          <w:szCs w:val="20"/>
+          <w:lang w:val="en-GB"/>
+        </w:rPr>
+        <w:t>10</w:t>
+      </w:r>
+      <w:r>
+        <w:rPr>
+          <w:sz w:val="20"/>
+          <w:szCs w:val="20"/>
+          <w:lang w:val="en-GB"/>
         </w:rPr>
         <w:t xml:space="preserve"> </w:t>
       </w:r>
@@ -640,33 +1081,17 @@
         <w:rPr>
           <w:sz w:val="20"/>
           <w:szCs w:val="20"/>
-          <w:lang w:val="en-US"/>
-        </w:rPr>
-        <w:t>---------------</w:t>
-      </w:r>
-      <w:r>
-        <w:rPr>
-          <w:sz w:val="20"/>
-          <w:szCs w:val="20"/>
-          <w:lang w:val="en-US"/>
-        </w:rPr>
-        <w:t>---------------------------------------------------------------------------</w:t>
-      </w:r>
-      <w:r>
-        <w:rPr>
-          <w:sz w:val="20"/>
-          <w:szCs w:val="20"/>
-          <w:lang w:val="en-US"/>
-        </w:rPr>
-        <w:t>-</w:t>
-      </w:r>
-      <w:r>
-        <w:rPr>
-          <w:sz w:val="20"/>
-          <w:szCs w:val="20"/>
-          <w:lang w:val="en-US"/>
-        </w:rPr>
-        <w:t>3</w:t>
+          <w:lang w:val="en-GB"/>
+        </w:rPr>
+        <w:t>Conditions for expulsion ---------------------</w:t>
+      </w:r>
+      <w:r>
+        <w:rPr>
+          <w:sz w:val="20"/>
+          <w:szCs w:val="20"/>
+          <w:lang w:val="en-GB"/>
+        </w:rPr>
+        <w:t>----------------------------------------------------------  6</w:t>
       </w:r>
     </w:p>
     <w:p>
@@ -684,48 +1109,23 @@
           <w:szCs w:val="20"/>
           <w:lang w:val="en-US"/>
         </w:rPr>
-        <w:t xml:space="preserve">3 </w:t>
-      </w:r>
-      <w:proofErr w:type="gramStart"/>
-      <w:r>
-        <w:rPr>
-          <w:sz w:val="20"/>
-          <w:szCs w:val="20"/>
-          <w:lang w:val="en-US"/>
-        </w:rPr>
-        <w:t>Introduc</w:t>
-      </w:r>
-      <w:r>
-        <w:rPr>
-          <w:sz w:val="20"/>
-          <w:szCs w:val="20"/>
-          <w:lang w:val="en-US"/>
-        </w:rPr>
-        <w:t xml:space="preserve">tion </w:t>
-      </w:r>
-      <w:r>
-        <w:rPr>
-          <w:sz w:val="20"/>
-          <w:szCs w:val="20"/>
-          <w:lang w:val="en-US"/>
-        </w:rPr>
-        <w:t xml:space="preserve"> </w:t>
-      </w:r>
-      <w:r>
-        <w:rPr>
-          <w:sz w:val="20"/>
-          <w:szCs w:val="20"/>
-          <w:lang w:val="en-US"/>
-        </w:rPr>
-        <w:t>--------</w:t>
-      </w:r>
-      <w:r>
-        <w:rPr>
-          <w:sz w:val="20"/>
-          <w:szCs w:val="20"/>
-          <w:lang w:val="en-US"/>
-        </w:rPr>
-        <w:t>-------------------------------------------------------------------------</w:t>
+        <w:t>1</w:t>
+      </w:r>
+      <w:r>
+        <w:rPr>
+          <w:sz w:val="20"/>
+          <w:szCs w:val="20"/>
+          <w:lang w:val="en-US"/>
+        </w:rPr>
+        <w:t>1</w:t>
+      </w:r>
+      <w:r>
+        <w:rPr>
+          <w:sz w:val="20"/>
+          <w:szCs w:val="20"/>
+          <w:lang w:val="en-US"/>
+        </w:rPr>
+        <w:t xml:space="preserve"> Signatures </w:t>
       </w:r>
       <w:r>
         <w:rPr>
@@ -735,14 +1135,13 @@
         </w:rPr>
         <w:t>-------------</w:t>
       </w:r>
-      <w:proofErr w:type="gramEnd"/>
-      <w:r>
-        <w:rPr>
-          <w:sz w:val="20"/>
-          <w:szCs w:val="20"/>
-          <w:lang w:val="en-US"/>
-        </w:rPr>
-        <w:t>3</w:t>
+      <w:r>
+        <w:rPr>
+          <w:sz w:val="20"/>
+          <w:szCs w:val="20"/>
+          <w:lang w:val="en-US"/>
+        </w:rPr>
+        <w:t>------------------------------------------------------------------------------------7</w:t>
       </w:r>
     </w:p>
     <w:p>
@@ -760,55 +1159,63 @@
           <w:szCs w:val="20"/>
           <w:lang w:val="en-US"/>
         </w:rPr>
-        <w:t xml:space="preserve">4 </w:t>
-      </w:r>
-      <w:r>
-        <w:rPr>
-          <w:sz w:val="20"/>
-          <w:szCs w:val="20"/>
-          <w:lang w:val="en-US"/>
-        </w:rPr>
-        <w:t xml:space="preserve">Summary </w:t>
-      </w:r>
-      <w:r>
-        <w:rPr>
-          <w:sz w:val="20"/>
-          <w:szCs w:val="20"/>
-          <w:lang w:val="en-US"/>
-        </w:rPr>
-        <w:t>------</w:t>
-      </w:r>
-      <w:r>
-        <w:rPr>
-          <w:sz w:val="20"/>
-          <w:szCs w:val="20"/>
-          <w:lang w:val="en-US"/>
-        </w:rPr>
-        <w:t>--------------------------------------------------------------------------------------</w:t>
-      </w:r>
-      <w:r>
-        <w:rPr>
-          <w:sz w:val="20"/>
-          <w:szCs w:val="20"/>
-          <w:lang w:val="en-US"/>
-        </w:rPr>
-        <w:t>--</w:t>
-      </w:r>
-      <w:r>
-        <w:rPr>
-          <w:sz w:val="20"/>
-          <w:szCs w:val="20"/>
-          <w:lang w:val="en-US"/>
-        </w:rPr>
-        <w:t>-----</w:t>
-      </w:r>
-      <w:r>
-        <w:rPr>
-          <w:sz w:val="20"/>
-          <w:szCs w:val="20"/>
-          <w:lang w:val="en-US"/>
-        </w:rPr>
-        <w:t>4</w:t>
+        <w:t>1</w:t>
+      </w:r>
+      <w:r>
+        <w:rPr>
+          <w:sz w:val="20"/>
+          <w:szCs w:val="20"/>
+          <w:lang w:val="en-US"/>
+        </w:rPr>
+        <w:t xml:space="preserve">2 </w:t>
+      </w:r>
+      <w:r>
+        <w:rPr>
+          <w:sz w:val="20"/>
+          <w:szCs w:val="20"/>
+          <w:lang w:val="en-US"/>
+        </w:rPr>
+        <w:t>Conclusi</w:t>
+      </w:r>
+      <w:r>
+        <w:rPr>
+          <w:sz w:val="20"/>
+          <w:szCs w:val="20"/>
+          <w:lang w:val="en-US"/>
+        </w:rPr>
+        <w:t>o</w:t>
+      </w:r>
+      <w:r>
+        <w:rPr>
+          <w:sz w:val="20"/>
+          <w:szCs w:val="20"/>
+          <w:lang w:val="en-US"/>
+        </w:rPr>
+        <w:t>n</w:t>
+      </w:r>
+      <w:r>
+        <w:rPr>
+          <w:sz w:val="20"/>
+          <w:szCs w:val="20"/>
+          <w:lang w:val="en-US"/>
+        </w:rPr>
+        <w:t xml:space="preserve"> ------------</w:t>
+      </w:r>
+      <w:r>
+        <w:rPr>
+          <w:sz w:val="20"/>
+          <w:szCs w:val="20"/>
+          <w:lang w:val="en-US"/>
+        </w:rPr>
+        <w:t>------------------------------------------------------------------------------------</w:t>
+      </w:r>
+      <w:r>
+        <w:rPr>
+          <w:sz w:val="20"/>
+          <w:szCs w:val="20"/>
+          <w:lang w:val="en-US"/>
+        </w:rPr>
+        <w:t>7</w:t>
       </w:r>
     </w:p>
     <w:p>
@@ -826,473 +1233,6 @@
           <w:szCs w:val="20"/>
           <w:lang w:val="en-US"/>
         </w:rPr>
-        <w:t xml:space="preserve">5 </w:t>
-      </w:r>
-      <w:r>
-        <w:rPr>
-          <w:sz w:val="20"/>
-          <w:szCs w:val="20"/>
-          <w:lang w:val="en-US"/>
-        </w:rPr>
-        <w:t>Wo</w:t>
-      </w:r>
-      <w:r>
-        <w:rPr>
-          <w:sz w:val="20"/>
-          <w:szCs w:val="20"/>
-          <w:lang w:val="en-US"/>
-        </w:rPr>
-        <w:t>rking group members</w:t>
-      </w:r>
-      <w:r>
-        <w:rPr>
-          <w:sz w:val="20"/>
-          <w:szCs w:val="20"/>
-          <w:lang w:val="en-US"/>
-        </w:rPr>
-        <w:t xml:space="preserve"> </w:t>
-      </w:r>
-      <w:r>
-        <w:rPr>
-          <w:sz w:val="20"/>
-          <w:szCs w:val="20"/>
-          <w:lang w:val="en-US"/>
-        </w:rPr>
-        <w:t>-----</w:t>
-      </w:r>
-      <w:r>
-        <w:rPr>
-          <w:sz w:val="20"/>
-          <w:szCs w:val="20"/>
-          <w:lang w:val="en-US"/>
-        </w:rPr>
-        <w:t>--------------------------------------------------------------------------</w:t>
-      </w:r>
-      <w:r>
-        <w:rPr>
-          <w:sz w:val="20"/>
-          <w:szCs w:val="20"/>
-          <w:lang w:val="en-US"/>
-        </w:rPr>
-        <w:t>-</w:t>
-      </w:r>
-      <w:r>
-        <w:rPr>
-          <w:sz w:val="20"/>
-          <w:szCs w:val="20"/>
-          <w:lang w:val="en-US"/>
-        </w:rPr>
-        <w:t>4</w:t>
-      </w:r>
-    </w:p>
-    <w:p>
-      <w:pPr>
-        <w:spacing w:before="240" w:after="240"/>
-        <w:rPr>
-          <w:sz w:val="20"/>
-          <w:szCs w:val="20"/>
-          <w:lang w:val="en-US"/>
-        </w:rPr>
-      </w:pPr>
-      <w:r>
-        <w:rPr>
-          <w:sz w:val="20"/>
-          <w:szCs w:val="20"/>
-          <w:lang w:val="en-US"/>
-        </w:rPr>
-        <w:t xml:space="preserve">6 </w:t>
-      </w:r>
-      <w:r>
-        <w:rPr>
-          <w:sz w:val="20"/>
-          <w:szCs w:val="20"/>
-          <w:lang w:val="en-US"/>
-        </w:rPr>
-        <w:t>Commitment Statement</w:t>
-      </w:r>
-      <w:r>
-        <w:rPr>
-          <w:sz w:val="20"/>
-          <w:szCs w:val="20"/>
-          <w:lang w:val="en-US"/>
-        </w:rPr>
-        <w:t xml:space="preserve"> </w:t>
-      </w:r>
-      <w:proofErr w:type="gramStart"/>
-      <w:r>
-        <w:rPr>
-          <w:sz w:val="20"/>
-          <w:szCs w:val="20"/>
-          <w:lang w:val="en-US"/>
-        </w:rPr>
-        <w:t>----------------------------------------------</w:t>
-      </w:r>
-      <w:r>
-        <w:rPr>
-          <w:sz w:val="20"/>
-          <w:szCs w:val="20"/>
-          <w:lang w:val="en-US"/>
-        </w:rPr>
-        <w:t>----------------------------</w:t>
-      </w:r>
-      <w:r>
-        <w:rPr>
-          <w:sz w:val="20"/>
-          <w:szCs w:val="20"/>
-          <w:lang w:val="en-US"/>
-        </w:rPr>
-        <w:t>-</w:t>
-      </w:r>
-      <w:r>
-        <w:rPr>
-          <w:sz w:val="20"/>
-          <w:szCs w:val="20"/>
-          <w:lang w:val="en-US"/>
-        </w:rPr>
-        <w:t>---</w:t>
-      </w:r>
-      <w:r>
-        <w:rPr>
-          <w:sz w:val="20"/>
-          <w:szCs w:val="20"/>
-          <w:lang w:val="en-US"/>
-        </w:rPr>
-        <w:t>-</w:t>
-      </w:r>
-      <w:r>
-        <w:rPr>
-          <w:sz w:val="20"/>
-          <w:szCs w:val="20"/>
-          <w:lang w:val="en-US"/>
-        </w:rPr>
-        <w:t xml:space="preserve">  </w:t>
-      </w:r>
-      <w:r>
-        <w:rPr>
-          <w:sz w:val="20"/>
-          <w:szCs w:val="20"/>
-          <w:lang w:val="en-US"/>
-        </w:rPr>
-        <w:t>5</w:t>
-      </w:r>
-      <w:proofErr w:type="gramEnd"/>
-    </w:p>
-    <w:p>
-      <w:pPr>
-        <w:spacing w:before="240" w:after="240"/>
-        <w:rPr>
-          <w:sz w:val="20"/>
-          <w:szCs w:val="20"/>
-        </w:rPr>
-      </w:pPr>
-      <w:r>
-        <w:rPr>
-          <w:sz w:val="20"/>
-          <w:szCs w:val="20"/>
-        </w:rPr>
-        <w:t xml:space="preserve">7 </w:t>
-      </w:r>
-      <w:proofErr w:type="gramStart"/>
-      <w:r>
-        <w:rPr>
-          <w:sz w:val="20"/>
-          <w:szCs w:val="20"/>
-        </w:rPr>
-        <w:t>Performance</w:t>
-      </w:r>
-      <w:proofErr w:type="gramEnd"/>
-      <w:r>
-        <w:rPr>
-          <w:sz w:val="20"/>
-          <w:szCs w:val="20"/>
-        </w:rPr>
-        <w:t xml:space="preserve"> </w:t>
-      </w:r>
-      <w:proofErr w:type="spellStart"/>
-      <w:r>
-        <w:rPr>
-          <w:sz w:val="20"/>
-          <w:szCs w:val="20"/>
-        </w:rPr>
-        <w:t>Indicators</w:t>
-      </w:r>
-      <w:proofErr w:type="spellEnd"/>
-      <w:r>
-        <w:rPr>
-          <w:sz w:val="20"/>
-          <w:szCs w:val="20"/>
-        </w:rPr>
-        <w:t>--</w:t>
-      </w:r>
-      <w:r>
-        <w:rPr>
-          <w:sz w:val="20"/>
-          <w:szCs w:val="20"/>
-        </w:rPr>
-        <w:t xml:space="preserve"> --------------------------------------------------------------------------</w:t>
-      </w:r>
-      <w:r>
-        <w:rPr>
-          <w:sz w:val="20"/>
-          <w:szCs w:val="20"/>
-        </w:rPr>
-        <w:t>----- 6</w:t>
-      </w:r>
-    </w:p>
-    <w:p>
-      <w:pPr>
-        <w:spacing w:before="240" w:after="240"/>
-        <w:rPr>
-          <w:sz w:val="20"/>
-          <w:szCs w:val="20"/>
-        </w:rPr>
-      </w:pPr>
-      <w:r>
-        <w:rPr>
-          <w:sz w:val="20"/>
-          <w:szCs w:val="20"/>
-        </w:rPr>
-        <w:t>8</w:t>
-      </w:r>
-      <w:r>
-        <w:rPr>
-          <w:sz w:val="20"/>
-          <w:szCs w:val="20"/>
-        </w:rPr>
-        <w:t xml:space="preserve"> </w:t>
-      </w:r>
-      <w:proofErr w:type="spellStart"/>
-      <w:r>
-        <w:rPr>
-          <w:sz w:val="20"/>
-          <w:szCs w:val="20"/>
-        </w:rPr>
-        <w:t>Reward</w:t>
-      </w:r>
-      <w:proofErr w:type="spellEnd"/>
-      <w:r>
-        <w:rPr>
-          <w:sz w:val="20"/>
-          <w:szCs w:val="20"/>
-        </w:rPr>
-        <w:t xml:space="preserve"> </w:t>
-      </w:r>
-      <w:proofErr w:type="spellStart"/>
-      <w:r>
-        <w:rPr>
-          <w:sz w:val="20"/>
-          <w:szCs w:val="20"/>
-        </w:rPr>
-        <w:t>System</w:t>
-      </w:r>
-      <w:proofErr w:type="spellEnd"/>
-      <w:r>
-        <w:rPr>
-          <w:sz w:val="20"/>
-          <w:szCs w:val="20"/>
-        </w:rPr>
-        <w:t xml:space="preserve"> ---------------------------------------</w:t>
-      </w:r>
-      <w:r>
-        <w:rPr>
-          <w:sz w:val="20"/>
-          <w:szCs w:val="20"/>
-        </w:rPr>
-        <w:t xml:space="preserve">---------------------------------------------------- </w:t>
-      </w:r>
-      <w:r>
-        <w:rPr>
-          <w:sz w:val="20"/>
-          <w:szCs w:val="20"/>
-        </w:rPr>
-        <w:t>6</w:t>
-      </w:r>
-    </w:p>
-    <w:p>
-      <w:pPr>
-        <w:spacing w:before="240" w:after="240"/>
-        <w:rPr>
-          <w:sz w:val="20"/>
-          <w:szCs w:val="20"/>
-        </w:rPr>
-      </w:pPr>
-      <w:r>
-        <w:rPr>
-          <w:sz w:val="20"/>
-          <w:szCs w:val="20"/>
-        </w:rPr>
-        <w:t>9</w:t>
-      </w:r>
-      <w:r>
-        <w:rPr>
-          <w:sz w:val="20"/>
-          <w:szCs w:val="20"/>
-        </w:rPr>
-        <w:t xml:space="preserve"> </w:t>
-      </w:r>
-      <w:proofErr w:type="spellStart"/>
-      <w:r>
-        <w:rPr>
-          <w:sz w:val="20"/>
-          <w:szCs w:val="20"/>
-        </w:rPr>
-        <w:t>Sanction</w:t>
-      </w:r>
-      <w:proofErr w:type="spellEnd"/>
-      <w:r>
-        <w:rPr>
-          <w:sz w:val="20"/>
-          <w:szCs w:val="20"/>
-        </w:rPr>
-        <w:t xml:space="preserve"> </w:t>
-      </w:r>
-      <w:proofErr w:type="spellStart"/>
-      <w:r>
-        <w:rPr>
-          <w:sz w:val="20"/>
-          <w:szCs w:val="20"/>
-        </w:rPr>
-        <w:t>System</w:t>
-      </w:r>
-      <w:proofErr w:type="spellEnd"/>
-      <w:r>
-        <w:rPr>
-          <w:sz w:val="20"/>
-          <w:szCs w:val="20"/>
-        </w:rPr>
-        <w:t xml:space="preserve"> </w:t>
-      </w:r>
-      <w:r>
-        <w:rPr>
-          <w:sz w:val="20"/>
-          <w:szCs w:val="20"/>
-        </w:rPr>
-        <w:t>---------------------------------------------------------------------------</w:t>
-      </w:r>
-      <w:r>
-        <w:rPr>
-          <w:sz w:val="20"/>
-          <w:szCs w:val="20"/>
-        </w:rPr>
-        <w:t>-------------</w:t>
-      </w:r>
-      <w:r>
-        <w:rPr>
-          <w:sz w:val="20"/>
-          <w:szCs w:val="20"/>
-        </w:rPr>
-        <w:t>--</w:t>
-      </w:r>
-      <w:r>
-        <w:rPr>
-          <w:sz w:val="20"/>
-          <w:szCs w:val="20"/>
-        </w:rPr>
-        <w:t xml:space="preserve"> 6</w:t>
-      </w:r>
-    </w:p>
-    <w:p>
-      <w:pPr>
-        <w:spacing w:before="240" w:after="240"/>
-        <w:rPr>
-          <w:sz w:val="20"/>
-          <w:szCs w:val="20"/>
-        </w:rPr>
-      </w:pPr>
-      <w:r>
-        <w:rPr>
-          <w:sz w:val="20"/>
-          <w:szCs w:val="20"/>
-        </w:rPr>
-        <w:t>10</w:t>
-      </w:r>
-      <w:r>
-        <w:rPr>
-          <w:sz w:val="20"/>
-          <w:szCs w:val="20"/>
-        </w:rPr>
-        <w:t xml:space="preserve"> </w:t>
-      </w:r>
-      <w:proofErr w:type="spellStart"/>
-      <w:r>
-        <w:rPr>
-          <w:sz w:val="20"/>
-          <w:szCs w:val="20"/>
-        </w:rPr>
-        <w:t>Conditions</w:t>
-      </w:r>
-      <w:proofErr w:type="spellEnd"/>
-      <w:r>
-        <w:rPr>
-          <w:sz w:val="20"/>
-          <w:szCs w:val="20"/>
-        </w:rPr>
-        <w:t xml:space="preserve"> </w:t>
-      </w:r>
-      <w:proofErr w:type="spellStart"/>
-      <w:r>
-        <w:rPr>
-          <w:sz w:val="20"/>
-          <w:szCs w:val="20"/>
-        </w:rPr>
-        <w:t>for</w:t>
-      </w:r>
-      <w:proofErr w:type="spellEnd"/>
-      <w:r>
-        <w:rPr>
-          <w:sz w:val="20"/>
-          <w:szCs w:val="20"/>
-        </w:rPr>
-        <w:t xml:space="preserve"> </w:t>
-      </w:r>
-      <w:proofErr w:type="spellStart"/>
-      <w:r>
-        <w:rPr>
-          <w:sz w:val="20"/>
-          <w:szCs w:val="20"/>
-        </w:rPr>
-        <w:t>expulsion</w:t>
-      </w:r>
-      <w:proofErr w:type="spellEnd"/>
-      <w:r>
-        <w:rPr>
-          <w:sz w:val="20"/>
-          <w:szCs w:val="20"/>
-        </w:rPr>
-        <w:t xml:space="preserve"> </w:t>
-      </w:r>
-      <w:proofErr w:type="gramStart"/>
-      <w:r>
-        <w:rPr>
-          <w:sz w:val="20"/>
-          <w:szCs w:val="20"/>
-        </w:rPr>
-        <w:t>---------------------</w:t>
-      </w:r>
-      <w:r>
-        <w:rPr>
-          <w:sz w:val="20"/>
-          <w:szCs w:val="20"/>
-        </w:rPr>
-        <w:t>----------------------------------------------------------  6</w:t>
-      </w:r>
-      <w:proofErr w:type="gramEnd"/>
-    </w:p>
-    <w:p>
-      <w:pPr>
-        <w:spacing w:before="240" w:after="240"/>
-        <w:rPr>
-          <w:sz w:val="20"/>
-          <w:szCs w:val="20"/>
-          <w:lang w:val="en-US"/>
-        </w:rPr>
-      </w:pPr>
-      <w:r>
-        <w:rPr>
-          <w:sz w:val="20"/>
-          <w:szCs w:val="20"/>
-          <w:lang w:val="en-US"/>
-        </w:rPr>
         <w:t>1</w:t>
       </w:r>
       <w:r>
@@ -1301,163 +1241,7 @@
           <w:szCs w:val="20"/>
           <w:lang w:val="en-US"/>
         </w:rPr>
-        <w:t>1</w:t>
-      </w:r>
-      <w:r>
-        <w:rPr>
-          <w:sz w:val="20"/>
-          <w:szCs w:val="20"/>
-          <w:lang w:val="en-US"/>
-        </w:rPr>
-        <w:t xml:space="preserve"> </w:t>
-      </w:r>
-      <w:r>
-        <w:rPr>
-          <w:sz w:val="20"/>
-          <w:szCs w:val="20"/>
-          <w:lang w:val="en-US"/>
-        </w:rPr>
-        <w:t>Signatures</w:t>
-      </w:r>
-      <w:r>
-        <w:rPr>
-          <w:sz w:val="20"/>
-          <w:szCs w:val="20"/>
-          <w:lang w:val="en-US"/>
-        </w:rPr>
-        <w:t xml:space="preserve"> </w:t>
-      </w:r>
-      <w:r>
-        <w:rPr>
-          <w:sz w:val="20"/>
-          <w:szCs w:val="20"/>
-          <w:lang w:val="en-US"/>
-        </w:rPr>
-        <w:t>-------------</w:t>
-      </w:r>
-      <w:r>
-        <w:rPr>
-          <w:sz w:val="20"/>
-          <w:szCs w:val="20"/>
-          <w:lang w:val="en-US"/>
-        </w:rPr>
-        <w:t>------------------------------------------------------------------------------------7</w:t>
-      </w:r>
-    </w:p>
-    <w:p>
-      <w:pPr>
-        <w:spacing w:before="240" w:after="240"/>
-        <w:rPr>
-          <w:sz w:val="20"/>
-          <w:szCs w:val="20"/>
-          <w:lang w:val="en-US"/>
-        </w:rPr>
-      </w:pPr>
-      <w:r>
-        <w:rPr>
-          <w:sz w:val="20"/>
-          <w:szCs w:val="20"/>
-          <w:lang w:val="en-US"/>
-        </w:rPr>
-        <w:t>1</w:t>
-      </w:r>
-      <w:r>
-        <w:rPr>
-          <w:sz w:val="20"/>
-          <w:szCs w:val="20"/>
-          <w:lang w:val="en-US"/>
-        </w:rPr>
-        <w:t xml:space="preserve">2 </w:t>
-      </w:r>
-      <w:r>
-        <w:rPr>
-          <w:sz w:val="20"/>
-          <w:szCs w:val="20"/>
-          <w:lang w:val="en-US"/>
-        </w:rPr>
-        <w:t>Conclusi</w:t>
-      </w:r>
-      <w:r>
-        <w:rPr>
-          <w:sz w:val="20"/>
-          <w:szCs w:val="20"/>
-          <w:lang w:val="en-US"/>
-        </w:rPr>
-        <w:t>o</w:t>
-      </w:r>
-      <w:r>
-        <w:rPr>
-          <w:sz w:val="20"/>
-          <w:szCs w:val="20"/>
-          <w:lang w:val="en-US"/>
-        </w:rPr>
-        <w:t>n</w:t>
-      </w:r>
-      <w:r>
-        <w:rPr>
-          <w:sz w:val="20"/>
-          <w:szCs w:val="20"/>
-          <w:lang w:val="en-US"/>
-        </w:rPr>
-        <w:t xml:space="preserve"> ------------</w:t>
-      </w:r>
-      <w:r>
-        <w:rPr>
-          <w:sz w:val="20"/>
-          <w:szCs w:val="20"/>
-          <w:lang w:val="en-US"/>
-        </w:rPr>
-        <w:t>------------------------------------------------------------------------------------</w:t>
-      </w:r>
-      <w:r>
-        <w:rPr>
-          <w:sz w:val="20"/>
-          <w:szCs w:val="20"/>
-          <w:lang w:val="en-US"/>
-        </w:rPr>
-        <w:t>7</w:t>
-      </w:r>
-    </w:p>
-    <w:p>
-      <w:pPr>
-        <w:spacing w:before="240" w:after="240"/>
-        <w:rPr>
-          <w:sz w:val="20"/>
-          <w:szCs w:val="20"/>
-          <w:lang w:val="en-US"/>
-        </w:rPr>
-      </w:pPr>
-      <w:r>
-        <w:rPr>
-          <w:sz w:val="20"/>
-          <w:szCs w:val="20"/>
-          <w:lang w:val="en-US"/>
-        </w:rPr>
-        <w:t>1</w:t>
-      </w:r>
-      <w:r>
-        <w:rPr>
-          <w:sz w:val="20"/>
-          <w:szCs w:val="20"/>
-          <w:lang w:val="en-US"/>
-        </w:rPr>
-        <w:t>3</w:t>
-      </w:r>
-      <w:r>
-        <w:rPr>
-          <w:sz w:val="20"/>
-          <w:szCs w:val="20"/>
-          <w:lang w:val="en-US"/>
-        </w:rPr>
-        <w:t xml:space="preserve"> </w:t>
-      </w:r>
-      <w:r>
-        <w:rPr>
-          <w:sz w:val="20"/>
-          <w:szCs w:val="20"/>
-          <w:lang w:val="en-US"/>
-        </w:rPr>
-        <w:t>Bibliography -----------</w:t>
+        <w:t>3 Bibliography -----------</w:t>
       </w:r>
       <w:r>
         <w:rPr>
@@ -1626,7 +1410,7 @@
     </w:p>
     <w:p>
       <w:pPr>
-        <w:pStyle w:val="Prrafodelista"/>
+        <w:pStyle w:val="ListParagraph"/>
         <w:numPr>
           <w:ilvl w:val="0"/>
           <w:numId w:val="8"/>
@@ -1654,20 +1438,8 @@
           <w:sz w:val="20"/>
           <w:szCs w:val="20"/>
         </w:rPr>
-        <w:t xml:space="preserve">Executive </w:t>
-      </w:r>
-      <w:proofErr w:type="spellStart"/>
-      <w:r>
-        <w:rPr>
-          <w:rFonts w:ascii="Arial" w:hAnsi="Arial" w:cs="Arial"/>
-          <w:b/>
-          <w:bCs/>
-          <w:sz w:val="20"/>
-          <w:szCs w:val="20"/>
-        </w:rPr>
-        <w:t>summary</w:t>
-      </w:r>
-      <w:proofErr w:type="spellEnd"/>
+        <w:t>Executive summary</w:t>
+      </w:r>
     </w:p>
     <w:p>
       <w:pPr>
@@ -1694,19 +1466,31 @@
           <w:lang w:val="en-US" w:eastAsia="es-ES_tradnl"/>
           <w14:ligatures w14:val="none"/>
         </w:rPr>
-        <w:t>T</w:t>
-      </w:r>
-      <w:r>
-        <w:rPr>
-          <w:rFonts w:ascii="Arial" w:eastAsia="Times New Roman" w:hAnsi="Arial" w:cs="Arial"/>
-          <w:color w:val="1F2328"/>
-          <w:kern w:val="0"/>
-          <w:sz w:val="20"/>
-          <w:szCs w:val="20"/>
-          <w:lang w:val="en-US" w:eastAsia="es-ES_tradnl"/>
-          <w14:ligatures w14:val="none"/>
-        </w:rPr>
-        <w:t>his document outlines the key elements of Group C1.033’s commitment to the project for the subject Design and Testing II. It details the procedures followed for team organization, the evaluation criteria, and accountability measures.</w:t>
+        <w:t>This document outlines the key elements of Group C</w:t>
+      </w:r>
+      <w:r>
+        <w:rPr>
+          <w:rFonts w:ascii="Arial" w:eastAsia="Times New Roman" w:hAnsi="Arial" w:cs="Arial"/>
+          <w:color w:val="1F2328"/>
+          <w:kern w:val="0"/>
+          <w:sz w:val="20"/>
+          <w:szCs w:val="20"/>
+          <w:lang w:val="en-US" w:eastAsia="es-ES_tradnl"/>
+          <w14:ligatures w14:val="none"/>
+        </w:rPr>
+        <w:t>2</w:t>
+      </w:r>
+      <w:r>
+        <w:rPr>
+          <w:rFonts w:ascii="Arial" w:eastAsia="Times New Roman" w:hAnsi="Arial" w:cs="Arial"/>
+          <w:color w:val="1F2328"/>
+          <w:kern w:val="0"/>
+          <w:sz w:val="20"/>
+          <w:szCs w:val="20"/>
+          <w:lang w:val="en-US" w:eastAsia="es-ES_tradnl"/>
+          <w14:ligatures w14:val="none"/>
+        </w:rPr>
+        <w:t>.033’s commitment to the project for the subject Design and Testing II. It details the procedures followed for team organization, the evaluation criteria, and accountability measures.</w:t>
       </w:r>
     </w:p>
     <w:p>
@@ -1767,7 +1551,7 @@
     </w:p>
     <w:p>
       <w:pPr>
-        <w:pStyle w:val="Prrafodelista"/>
+        <w:pStyle w:val="ListParagraph"/>
         <w:numPr>
           <w:ilvl w:val="0"/>
           <w:numId w:val="8"/>
@@ -1785,7 +1569,6 @@
           <w14:ligatures w14:val="none"/>
         </w:rPr>
       </w:pPr>
-      <w:proofErr w:type="spellStart"/>
       <w:r>
         <w:rPr>
           <w:rFonts w:ascii="Arial" w:hAnsi="Arial" w:cs="Arial"/>
@@ -1794,9 +1577,8 @@
           <w:sz w:val="20"/>
           <w:szCs w:val="20"/>
         </w:rPr>
-        <w:t>Revision</w:t>
-      </w:r>
-      <w:proofErr w:type="spellEnd"/>
+        <w:t>Revision Table</w:t>
+      </w:r>
       <w:r>
         <w:rPr>
           <w:rFonts w:ascii="Arial" w:hAnsi="Arial" w:cs="Arial"/>
@@ -1805,22 +1587,12 @@
           <w:sz w:val="20"/>
           <w:szCs w:val="20"/>
         </w:rPr>
-        <w:t xml:space="preserve"> Table</w:t>
-      </w:r>
-      <w:r>
-        <w:rPr>
-          <w:rFonts w:ascii="Arial" w:hAnsi="Arial" w:cs="Arial"/>
-          <w:b/>
-          <w:bCs/>
-          <w:sz w:val="20"/>
-          <w:szCs w:val="20"/>
-        </w:rPr>
         <w:tab/>
       </w:r>
     </w:p>
     <w:p>
       <w:pPr>
-        <w:pStyle w:val="Prrafodelista"/>
+        <w:pStyle w:val="ListParagraph"/>
         <w:shd w:val="clear" w:color="auto" w:fill="FFFFFF"/>
         <w:tabs>
           <w:tab w:val="left" w:pos="2719"/>
@@ -1836,7 +1608,7 @@
     </w:p>
     <w:tbl>
       <w:tblPr>
-        <w:tblStyle w:val="Tablaconcuadrcula"/>
+        <w:tblStyle w:val="TableGrid"/>
         <w:tblW w:w="0" w:type="auto"/>
         <w:tblInd w:w="720" w:type="dxa"/>
         <w:tblLook w:val="04A0" w:firstRow="1" w:lastRow="0" w:firstColumn="1" w:lastColumn="0" w:noHBand="0" w:noVBand="1"/>
@@ -1849,11 +1621,11 @@
       <w:tr>
         <w:tc>
           <w:tcPr>
-            <w:tcW w:w="2831" w:type="dxa"/>
+            <w:tcW w:w="2566" w:type="dxa"/>
           </w:tcPr>
           <w:p>
             <w:pPr>
-              <w:pStyle w:val="Prrafodelista"/>
+              <w:pStyle w:val="ListParagraph"/>
               <w:spacing w:before="360" w:after="80"/>
               <w:ind w:left="0"/>
               <w:outlineLvl w:val="1"/>
@@ -1883,11 +1655,11 @@
         </w:tc>
         <w:tc>
           <w:tcPr>
-            <w:tcW w:w="2831" w:type="dxa"/>
+            <w:tcW w:w="2596" w:type="dxa"/>
           </w:tcPr>
           <w:p>
             <w:pPr>
-              <w:pStyle w:val="Prrafodelista"/>
+              <w:pStyle w:val="ListParagraph"/>
               <w:spacing w:before="360" w:after="80"/>
               <w:ind w:left="0"/>
               <w:outlineLvl w:val="1"/>
@@ -1917,11 +1689,11 @@
         </w:tc>
         <w:tc>
           <w:tcPr>
-            <w:tcW w:w="2832" w:type="dxa"/>
+            <w:tcW w:w="2612" w:type="dxa"/>
           </w:tcPr>
           <w:p>
             <w:pPr>
-              <w:pStyle w:val="Prrafodelista"/>
+              <w:pStyle w:val="ListParagraph"/>
               <w:spacing w:before="360" w:after="80"/>
               <w:ind w:left="0"/>
               <w:outlineLvl w:val="1"/>
@@ -1956,11 +1728,11 @@
         </w:trPr>
         <w:tc>
           <w:tcPr>
-            <w:tcW w:w="2831" w:type="dxa"/>
+            <w:tcW w:w="2566" w:type="dxa"/>
           </w:tcPr>
           <w:p>
             <w:pPr>
-              <w:pStyle w:val="Prrafodelista"/>
+              <w:pStyle w:val="ListParagraph"/>
               <w:spacing w:before="360" w:after="80"/>
               <w:ind w:left="0"/>
               <w:outlineLvl w:val="1"/>
@@ -1990,11 +1762,11 @@
         </w:tc>
         <w:tc>
           <w:tcPr>
-            <w:tcW w:w="2831" w:type="dxa"/>
+            <w:tcW w:w="2596" w:type="dxa"/>
           </w:tcPr>
           <w:p>
             <w:pPr>
-              <w:pStyle w:val="Prrafodelista"/>
+              <w:pStyle w:val="ListParagraph"/>
               <w:spacing w:before="360" w:after="80"/>
               <w:ind w:left="0"/>
               <w:outlineLvl w:val="1"/>
@@ -2011,7 +1783,7 @@
           </w:p>
           <w:p>
             <w:pPr>
-              <w:pStyle w:val="Prrafodelista"/>
+              <w:pStyle w:val="ListParagraph"/>
               <w:spacing w:before="360" w:after="80"/>
               <w:ind w:left="0"/>
               <w:outlineLvl w:val="1"/>
@@ -2028,7 +1800,7 @@
           </w:p>
           <w:p>
             <w:pPr>
-              <w:pStyle w:val="Prrafodelista"/>
+              <w:pStyle w:val="ListParagraph"/>
               <w:spacing w:before="360" w:after="80"/>
               <w:ind w:left="0"/>
               <w:outlineLvl w:val="1"/>
@@ -2058,11 +1830,11 @@
         </w:tc>
         <w:tc>
           <w:tcPr>
-            <w:tcW w:w="2832" w:type="dxa"/>
+            <w:tcW w:w="2612" w:type="dxa"/>
           </w:tcPr>
           <w:p>
             <w:pPr>
-              <w:pStyle w:val="Prrafodelista"/>
+              <w:pStyle w:val="ListParagraph"/>
               <w:spacing w:before="360" w:after="80"/>
               <w:ind w:left="0"/>
               <w:outlineLvl w:val="1"/>
@@ -2079,7 +1851,7 @@
           </w:p>
           <w:p>
             <w:pPr>
-              <w:pStyle w:val="Prrafodelista"/>
+              <w:pStyle w:val="ListParagraph"/>
               <w:spacing w:before="360" w:after="80"/>
               <w:ind w:left="0"/>
               <w:outlineLvl w:val="1"/>
@@ -2096,7 +1868,7 @@
           </w:p>
           <w:p>
             <w:pPr>
-              <w:pStyle w:val="Prrafodelista"/>
+              <w:pStyle w:val="ListParagraph"/>
               <w:spacing w:before="360" w:after="80"/>
               <w:ind w:left="0"/>
               <w:outlineLvl w:val="1"/>
@@ -2131,11 +1903,11 @@
         </w:trPr>
         <w:tc>
           <w:tcPr>
-            <w:tcW w:w="2831" w:type="dxa"/>
+            <w:tcW w:w="2566" w:type="dxa"/>
           </w:tcPr>
           <w:p>
             <w:pPr>
-              <w:pStyle w:val="Prrafodelista"/>
+              <w:pStyle w:val="ListParagraph"/>
               <w:spacing w:before="360" w:after="80"/>
               <w:ind w:left="0"/>
               <w:outlineLvl w:val="1"/>
@@ -2165,11 +1937,11 @@
         </w:tc>
         <w:tc>
           <w:tcPr>
-            <w:tcW w:w="2831" w:type="dxa"/>
+            <w:tcW w:w="2596" w:type="dxa"/>
           </w:tcPr>
           <w:p>
             <w:pPr>
-              <w:pStyle w:val="Prrafodelista"/>
+              <w:pStyle w:val="ListParagraph"/>
               <w:spacing w:before="360" w:after="80"/>
               <w:ind w:left="0"/>
               <w:outlineLvl w:val="1"/>
@@ -2186,7 +1958,7 @@
           </w:p>
           <w:p>
             <w:pPr>
-              <w:pStyle w:val="Prrafodelista"/>
+              <w:pStyle w:val="ListParagraph"/>
               <w:spacing w:before="360" w:after="80"/>
               <w:ind w:left="0"/>
               <w:outlineLvl w:val="1"/>
@@ -2203,7 +1975,7 @@
           </w:p>
           <w:p>
             <w:pPr>
-              <w:pStyle w:val="Prrafodelista"/>
+              <w:pStyle w:val="ListParagraph"/>
               <w:spacing w:before="360" w:after="80"/>
               <w:ind w:left="0"/>
               <w:outlineLvl w:val="1"/>
@@ -2233,11 +2005,11 @@
         </w:tc>
         <w:tc>
           <w:tcPr>
-            <w:tcW w:w="2832" w:type="dxa"/>
+            <w:tcW w:w="2612" w:type="dxa"/>
           </w:tcPr>
           <w:p>
             <w:pPr>
-              <w:pStyle w:val="Prrafodelista"/>
+              <w:pStyle w:val="ListParagraph"/>
               <w:spacing w:before="360" w:after="80"/>
               <w:ind w:left="0"/>
               <w:outlineLvl w:val="1"/>
@@ -2254,7 +2026,7 @@
           </w:p>
           <w:p>
             <w:pPr>
-              <w:pStyle w:val="Prrafodelista"/>
+              <w:pStyle w:val="ListParagraph"/>
               <w:spacing w:before="360" w:after="80"/>
               <w:ind w:left="0"/>
               <w:outlineLvl w:val="1"/>
@@ -2271,7 +2043,7 @@
           </w:p>
           <w:p>
             <w:pPr>
-              <w:pStyle w:val="Prrafodelista"/>
+              <w:pStyle w:val="ListParagraph"/>
               <w:spacing w:before="360" w:after="80"/>
               <w:ind w:left="0"/>
               <w:outlineLvl w:val="1"/>
@@ -2300,10 +2072,151 @@
           </w:p>
         </w:tc>
       </w:tr>
+      <w:tr>
+        <w:trPr>
+          <w:trHeight w:val="1131"/>
+        </w:trPr>
+        <w:tc>
+          <w:tcPr>
+            <w:tcW w:w="2566" w:type="dxa"/>
+          </w:tcPr>
+          <w:p>
+            <w:pPr>
+              <w:pStyle w:val="ListParagraph"/>
+              <w:spacing w:before="360" w:after="80"/>
+              <w:ind w:left="0"/>
+              <w:outlineLvl w:val="1"/>
+              <w:rPr>
+                <w:rFonts w:ascii="Arial" w:eastAsia="Times New Roman" w:hAnsi="Arial" w:cs="Arial"/>
+                <w:color w:val="1F2328"/>
+                <w:kern w:val="0"/>
+                <w:sz w:val="20"/>
+                <w:szCs w:val="20"/>
+                <w:lang w:val="en-US" w:eastAsia="es-ES_tradnl"/>
+                <w14:ligatures w14:val="none"/>
+              </w:rPr>
+            </w:pPr>
+            <w:r>
+              <w:rPr>
+                <w:rFonts w:ascii="Arial" w:eastAsia="Times New Roman" w:hAnsi="Arial" w:cs="Arial"/>
+                <w:color w:val="1F2328"/>
+                <w:kern w:val="0"/>
+                <w:sz w:val="20"/>
+                <w:szCs w:val="20"/>
+                <w:lang w:val="en-US" w:eastAsia="es-ES_tradnl"/>
+                <w14:ligatures w14:val="none"/>
+              </w:rPr>
+              <w:t>2.0.0</w:t>
+            </w:r>
+          </w:p>
+        </w:tc>
+        <w:tc>
+          <w:tcPr>
+            <w:tcW w:w="2596" w:type="dxa"/>
+          </w:tcPr>
+          <w:p>
+            <w:pPr>
+              <w:pStyle w:val="ListParagraph"/>
+              <w:spacing w:before="360" w:after="80"/>
+              <w:ind w:left="0"/>
+              <w:outlineLvl w:val="1"/>
+              <w:rPr>
+                <w:rFonts w:ascii="Arial" w:eastAsia="Times New Roman" w:hAnsi="Arial" w:cs="Arial"/>
+                <w:color w:val="1F2328"/>
+                <w:kern w:val="0"/>
+                <w:sz w:val="20"/>
+                <w:szCs w:val="20"/>
+                <w:lang w:val="en-US" w:eastAsia="es-ES_tradnl"/>
+                <w14:ligatures w14:val="none"/>
+              </w:rPr>
+            </w:pPr>
+          </w:p>
+          <w:p>
+            <w:pPr>
+              <w:pStyle w:val="ListParagraph"/>
+              <w:spacing w:before="360" w:after="80"/>
+              <w:ind w:left="0"/>
+              <w:outlineLvl w:val="1"/>
+              <w:rPr>
+                <w:rFonts w:ascii="Arial" w:eastAsia="Times New Roman" w:hAnsi="Arial" w:cs="Arial"/>
+                <w:color w:val="1F2328"/>
+                <w:kern w:val="0"/>
+                <w:sz w:val="20"/>
+                <w:szCs w:val="20"/>
+                <w:lang w:val="en-US" w:eastAsia="es-ES_tradnl"/>
+                <w14:ligatures w14:val="none"/>
+              </w:rPr>
+            </w:pPr>
+            <w:r>
+              <w:rPr>
+                <w:rFonts w:ascii="Arial" w:eastAsia="Times New Roman" w:hAnsi="Arial" w:cs="Arial"/>
+                <w:color w:val="1F2328"/>
+                <w:kern w:val="0"/>
+                <w:sz w:val="20"/>
+                <w:szCs w:val="20"/>
+                <w:lang w:val="en-US" w:eastAsia="es-ES_tradnl"/>
+                <w14:ligatures w14:val="none"/>
+              </w:rPr>
+              <w:t>01/07/2025</w:t>
+            </w:r>
+          </w:p>
+        </w:tc>
+        <w:tc>
+          <w:tcPr>
+            <w:tcW w:w="2612" w:type="dxa"/>
+          </w:tcPr>
+          <w:p>
+            <w:pPr>
+              <w:pStyle w:val="ListParagraph"/>
+              <w:spacing w:before="360" w:after="80"/>
+              <w:ind w:left="0"/>
+              <w:outlineLvl w:val="1"/>
+              <w:rPr>
+                <w:rFonts w:ascii="Arial" w:eastAsia="Times New Roman" w:hAnsi="Arial" w:cs="Arial"/>
+                <w:color w:val="1F2328"/>
+                <w:kern w:val="0"/>
+                <w:sz w:val="20"/>
+                <w:szCs w:val="20"/>
+                <w:lang w:val="en-US" w:eastAsia="es-ES_tradnl"/>
+                <w14:ligatures w14:val="none"/>
+              </w:rPr>
+            </w:pPr>
+          </w:p>
+          <w:p>
+            <w:pPr>
+              <w:pStyle w:val="ListParagraph"/>
+              <w:spacing w:before="360" w:after="80"/>
+              <w:ind w:left="0"/>
+              <w:outlineLvl w:val="1"/>
+              <w:rPr>
+                <w:rFonts w:ascii="Arial" w:eastAsia="Times New Roman" w:hAnsi="Arial" w:cs="Arial"/>
+                <w:color w:val="1F2328"/>
+                <w:kern w:val="0"/>
+                <w:sz w:val="20"/>
+                <w:szCs w:val="20"/>
+                <w:lang w:val="en-US" w:eastAsia="es-ES_tradnl"/>
+                <w14:ligatures w14:val="none"/>
+              </w:rPr>
+            </w:pPr>
+            <w:r>
+              <w:rPr>
+                <w:rFonts w:ascii="Arial" w:eastAsia="Times New Roman" w:hAnsi="Arial" w:cs="Arial"/>
+                <w:color w:val="1F2328"/>
+                <w:kern w:val="0"/>
+                <w:sz w:val="20"/>
+                <w:szCs w:val="20"/>
+                <w:lang w:val="en-US" w:eastAsia="es-ES_tradnl"/>
+                <w14:ligatures w14:val="none"/>
+              </w:rPr>
+              <w:t>Second call version</w:t>
+            </w:r>
+          </w:p>
+        </w:tc>
+      </w:tr>
     </w:tbl>
     <w:p>
       <w:pPr>
-        <w:pStyle w:val="Prrafodelista"/>
+        <w:pStyle w:val="ListParagraph"/>
         <w:numPr>
           <w:ilvl w:val="0"/>
           <w:numId w:val="8"/>
@@ -2363,7 +2276,31 @@
           <w:lang w:val="en-US" w:eastAsia="es-ES_tradnl"/>
           <w14:ligatures w14:val="none"/>
         </w:rPr>
-        <w:t>This document serves as the official project agreement for Group C1.033 in the subject Design and Testing II. It establishes the roles, responsibilities, and evaluation criteria that will govern the team’s performance and collaboration throughout the course. By setting clear expectations from the outset, the group aims to foster a productive and cooperative working environment.</w:t>
+        <w:t>This document serves as the official project agreement for Group C</w:t>
+      </w:r>
+      <w:r>
+        <w:rPr>
+          <w:rFonts w:ascii="Arial" w:eastAsia="Times New Roman" w:hAnsi="Arial" w:cs="Arial"/>
+          <w:color w:val="1F2328"/>
+          <w:kern w:val="0"/>
+          <w:sz w:val="20"/>
+          <w:szCs w:val="20"/>
+          <w:lang w:val="en-US" w:eastAsia="es-ES_tradnl"/>
+          <w14:ligatures w14:val="none"/>
+        </w:rPr>
+        <w:t>2</w:t>
+      </w:r>
+      <w:r>
+        <w:rPr>
+          <w:rFonts w:ascii="Arial" w:eastAsia="Times New Roman" w:hAnsi="Arial" w:cs="Arial"/>
+          <w:color w:val="1F2328"/>
+          <w:kern w:val="0"/>
+          <w:sz w:val="20"/>
+          <w:szCs w:val="20"/>
+          <w:lang w:val="en-US" w:eastAsia="es-ES_tradnl"/>
+          <w14:ligatures w14:val="none"/>
+        </w:rPr>
+        <w:t>.033 in the subject Design and Testing II. It establishes the roles, responsibilities, and evaluation criteria that will govern the team’s performance and collaboration throughout the course. By setting clear expectations from the outset, the group aims to foster a productive and cooperative working environment.</w:t>
       </w:r>
     </w:p>
     <w:p>
@@ -2391,33 +2328,7 @@
           <w:lang w:val="en-US" w:eastAsia="es-ES_tradnl"/>
           <w14:ligatures w14:val="none"/>
         </w:rPr>
-        <w:t xml:space="preserve">The report begins with an overview of the recruitment process, explaining how the team was formed and how a project leader was selected. This is followed by the Commitment Statement, in which all members express their willingness to collaborate and acknowledge their understanding of the course syllabus. The Performance Indicators section defines how </w:t>
-      </w:r>
-      <w:proofErr w:type="gramStart"/>
-      <w:r>
-        <w:rPr>
-          <w:rFonts w:ascii="Arial" w:eastAsia="Times New Roman" w:hAnsi="Arial" w:cs="Arial"/>
-          <w:color w:val="1F2328"/>
-          <w:kern w:val="0"/>
-          <w:sz w:val="20"/>
-          <w:szCs w:val="20"/>
-          <w:lang w:val="en-US" w:eastAsia="es-ES_tradnl"/>
-          <w14:ligatures w14:val="none"/>
-        </w:rPr>
-        <w:t>individual</w:t>
-      </w:r>
-      <w:proofErr w:type="gramEnd"/>
-      <w:r>
-        <w:rPr>
-          <w:rFonts w:ascii="Arial" w:eastAsia="Times New Roman" w:hAnsi="Arial" w:cs="Arial"/>
-          <w:color w:val="1F2328"/>
-          <w:kern w:val="0"/>
-          <w:sz w:val="20"/>
-          <w:szCs w:val="20"/>
-          <w:lang w:val="en-US" w:eastAsia="es-ES_tradnl"/>
-          <w14:ligatures w14:val="none"/>
-        </w:rPr>
-        <w:t xml:space="preserve"> and group contributions will be monitored and assessed.</w:t>
+        <w:t>The report begins with an overview of the recruitment process, explaining how the team was formed and how a project leader was selected. This is followed by the Commitment Statement, in which all members express their willingness to collaborate and acknowledge their understanding of the course syllabus. The Performance Indicators section defines how individual and group contributions will be monitored and assessed.</w:t>
       </w:r>
     </w:p>
     <w:p>
@@ -2445,7 +2356,20 @@
           <w:lang w:val="en-US" w:eastAsia="es-ES_tradnl"/>
           <w14:ligatures w14:val="none"/>
         </w:rPr>
-        <w:t>Subsequent sections address both the recognition of high performance and the handling of underperformance. A system has been put in place to reward outstanding contributions, ensuring that excellent work is acknowledged. At the same time, measures have been established to deal with insufficient participation, including the possibility of reporting or dismissing underperforming members when necessary.</w:t>
+        <w:t xml:space="preserve">Subsequent sections address both the recognition of high performance and the handling of underperformance. A system has been put in place to reward outstanding contributions, ensuring that excellent work is acknowledged. At the same time, measures have been </w:t>
+      </w:r>
+      <w:r>
+        <w:rPr>
+          <w:rFonts w:ascii="Arial" w:eastAsia="Times New Roman" w:hAnsi="Arial" w:cs="Arial"/>
+          <w:color w:val="1F2328"/>
+          <w:kern w:val="0"/>
+          <w:sz w:val="20"/>
+          <w:szCs w:val="20"/>
+          <w:lang w:val="en-US" w:eastAsia="es-ES_tradnl"/>
+          <w14:ligatures w14:val="none"/>
+        </w:rPr>
+        <w:lastRenderedPageBreak/>
+        <w:t>established to deal with insufficient participation, including the possibility of reporting or dismissing underperforming members when necessary.</w:t>
       </w:r>
     </w:p>
     <w:p>
@@ -2473,7 +2397,6 @@
           <w:lang w:val="en-US" w:eastAsia="es-ES_tradnl"/>
           <w14:ligatures w14:val="none"/>
         </w:rPr>
-        <w:lastRenderedPageBreak/>
         <w:t>In the following sections, each of these elements is detailed, providing a clear framework to guide the team's work during the project.</w:t>
       </w:r>
     </w:p>
@@ -2553,97 +2476,6 @@
     </w:p>
     <w:p>
       <w:pPr>
-        <w:shd w:val="clear" w:color="auto" w:fill="FFFFFF"/>
-        <w:spacing w:after="0" w:line="240" w:lineRule="auto"/>
-        <w:rPr>
-          <w:rFonts w:ascii="Arial" w:eastAsia="Times New Roman" w:hAnsi="Arial" w:cs="Arial"/>
-          <w:kern w:val="0"/>
-          <w:sz w:val="20"/>
-          <w:szCs w:val="20"/>
-          <w:lang w:val="en-US" w:eastAsia="es-ES_tradnl"/>
-          <w14:ligatures w14:val="none"/>
-        </w:rPr>
-      </w:pPr>
-      <w:r>
-        <w:rPr>
-          <w:rFonts w:ascii="Arial" w:eastAsia="Times New Roman" w:hAnsi="Arial" w:cs="Arial"/>
-          <w:color w:val="1F2328"/>
-          <w:kern w:val="0"/>
-          <w:sz w:val="20"/>
-          <w:szCs w:val="20"/>
-          <w:lang w:val="en-US" w:eastAsia="es-ES_tradnl"/>
-          <w14:ligatures w14:val="none"/>
-        </w:rPr>
-        <w:t>The selection of the working group members was carried out simply through the forum. To choose the members, we focused on people we had previously worked with, prioritizing trust and knowledge of their work style. In this case, we had already collaborated on previous projects, making the decision easier.</w:t>
-      </w:r>
-      <w:r>
-        <w:rPr>
-          <w:rFonts w:ascii="Arial" w:eastAsia="Times New Roman" w:hAnsi="Arial" w:cs="Arial"/>
-          <w:color w:val="1F2328"/>
-          <w:kern w:val="0"/>
-          <w:sz w:val="20"/>
-          <w:szCs w:val="20"/>
-          <w:lang w:val="en-US" w:eastAsia="es-ES_tradnl"/>
-          <w14:ligatures w14:val="none"/>
-        </w:rPr>
-        <w:br/>
-      </w:r>
-      <w:r>
-        <w:rPr>
-          <w:rFonts w:ascii="Arial" w:eastAsia="Times New Roman" w:hAnsi="Arial" w:cs="Arial"/>
-          <w:color w:val="1F2328"/>
-          <w:kern w:val="0"/>
-          <w:sz w:val="20"/>
-          <w:szCs w:val="20"/>
-          <w:lang w:val="en-US" w:eastAsia="es-ES_tradnl"/>
-          <w14:ligatures w14:val="none"/>
-        </w:rPr>
-        <w:br/>
-      </w:r>
-    </w:p>
-    <w:p>
-      <w:pPr>
-        <w:shd w:val="clear" w:color="auto" w:fill="FFFFFF"/>
-        <w:spacing w:after="0" w:line="240" w:lineRule="auto"/>
-        <w:rPr>
-          <w:rFonts w:ascii="Arial" w:eastAsia="Times New Roman" w:hAnsi="Arial" w:cs="Arial"/>
-          <w:kern w:val="0"/>
-          <w:sz w:val="20"/>
-          <w:szCs w:val="20"/>
-          <w:lang w:val="en-US" w:eastAsia="es-ES_tradnl"/>
-          <w14:ligatures w14:val="none"/>
-        </w:rPr>
-      </w:pPr>
-      <w:r>
-        <w:rPr>
-          <w:rFonts w:ascii="Arial" w:eastAsia="Times New Roman" w:hAnsi="Arial" w:cs="Arial"/>
-          <w:color w:val="1F2328"/>
-          <w:kern w:val="0"/>
-          <w:sz w:val="20"/>
-          <w:szCs w:val="20"/>
-          <w:lang w:val="en-US" w:eastAsia="es-ES_tradnl"/>
-          <w14:ligatures w14:val="none"/>
-        </w:rPr>
-        <w:t xml:space="preserve">Link to the recruitment forum thread: </w:t>
-      </w:r>
-      <w:hyperlink r:id="rId6" w:history="1">
-        <w:r>
-          <w:rPr>
-            <w:rFonts w:ascii="Arial" w:eastAsia="Times New Roman" w:hAnsi="Arial" w:cs="Arial"/>
-            <w:color w:val="1155CC"/>
-            <w:kern w:val="0"/>
-            <w:sz w:val="20"/>
-            <w:szCs w:val="20"/>
-            <w:u w:val="single"/>
-            <w:lang w:val="en-US" w:eastAsia="es-ES_tradnl"/>
-            <w14:ligatures w14:val="none"/>
-          </w:rPr>
-          <w:t>https://ev.us.es/webapps/discussionboard/do/message?action=list_messages&amp;course_id=_89154_1&amp;nav=discussion_board&amp;conf_id=_426211_1&amp;forum_id=_253523_1&amp;message_id=_456394_1</w:t>
-        </w:r>
-      </w:hyperlink>
-    </w:p>
-    <w:p>
-      <w:pPr>
         <w:spacing w:after="0" w:line="240" w:lineRule="auto"/>
         <w:rPr>
           <w:rFonts w:ascii="Arial" w:eastAsia="Times New Roman" w:hAnsi="Arial" w:cs="Arial"/>
@@ -2653,10 +2485,22 @@
           <w:kern w:val="0"/>
           <w:sz w:val="20"/>
           <w:szCs w:val="20"/>
-          <w:lang w:eastAsia="es-ES_tradnl"/>
-          <w14:ligatures w14:val="none"/>
-        </w:rPr>
-      </w:pPr>
+          <w:lang w:val="en-GB" w:eastAsia="es-ES_tradnl"/>
+          <w14:ligatures w14:val="none"/>
+        </w:rPr>
+      </w:pPr>
+      <w:r>
+        <w:rPr>
+          <w:rFonts w:ascii="Arial" w:eastAsia="Times New Roman" w:hAnsi="Arial" w:cs="Arial"/>
+          <w:color w:val="1F2328"/>
+          <w:kern w:val="0"/>
+          <w:sz w:val="20"/>
+          <w:szCs w:val="20"/>
+          <w:lang w:val="en-US" w:eastAsia="es-ES_tradnl"/>
+          <w14:ligatures w14:val="none"/>
+        </w:rPr>
+        <w:t>The selection of the working group was simple, since we simply continued the same members that remained from the previous group. Having previously worked together, there was already a base of trust and mutual knowledge about our ways of working, which made it easier to maintain the established collaboration dynamic.</w:t>
+      </w:r>
     </w:p>
     <w:p>
       <w:pPr>
@@ -2669,7 +2513,7 @@
           <w:kern w:val="0"/>
           <w:sz w:val="20"/>
           <w:szCs w:val="20"/>
-          <w:lang w:eastAsia="es-ES_tradnl"/>
+          <w:lang w:val="en-GB" w:eastAsia="es-ES_tradnl"/>
           <w14:ligatures w14:val="none"/>
         </w:rPr>
       </w:pPr>
@@ -2685,7 +2529,7 @@
           <w:kern w:val="0"/>
           <w:sz w:val="20"/>
           <w:szCs w:val="20"/>
-          <w:lang w:eastAsia="es-ES_tradnl"/>
+          <w:lang w:val="en-GB" w:eastAsia="es-ES_tradnl"/>
           <w14:ligatures w14:val="none"/>
         </w:rPr>
       </w:pPr>
@@ -2701,7 +2545,7 @@
           <w:kern w:val="0"/>
           <w:sz w:val="20"/>
           <w:szCs w:val="20"/>
-          <w:lang w:eastAsia="es-ES_tradnl"/>
+          <w:lang w:val="en-GB" w:eastAsia="es-ES_tradnl"/>
           <w14:ligatures w14:val="none"/>
         </w:rPr>
       </w:pPr>
@@ -2745,84 +2589,8 @@
           <w:lang w:eastAsia="es-ES_tradnl"/>
           <w14:ligatures w14:val="none"/>
         </w:rPr>
-        <w:t>. W</w:t>
-      </w:r>
-      <w:proofErr w:type="spellStart"/>
-      <w:r>
-        <w:rPr>
-          <w:rFonts w:ascii="Arial" w:eastAsia="Times New Roman" w:hAnsi="Arial" w:cs="Arial"/>
-          <w:b/>
-          <w:bCs/>
-          <w:color w:val="1F2328"/>
-          <w:kern w:val="0"/>
-          <w:sz w:val="20"/>
-          <w:szCs w:val="20"/>
-          <w:lang w:eastAsia="es-ES_tradnl"/>
-          <w14:ligatures w14:val="none"/>
-        </w:rPr>
-        <w:t>orking</w:t>
-      </w:r>
-      <w:proofErr w:type="spellEnd"/>
-      <w:r>
-        <w:rPr>
-          <w:rFonts w:ascii="Arial" w:eastAsia="Times New Roman" w:hAnsi="Arial" w:cs="Arial"/>
-          <w:b/>
-          <w:bCs/>
-          <w:color w:val="1F2328"/>
-          <w:kern w:val="0"/>
-          <w:sz w:val="20"/>
-          <w:szCs w:val="20"/>
-          <w:lang w:eastAsia="es-ES_tradnl"/>
-          <w14:ligatures w14:val="none"/>
-        </w:rPr>
-        <w:t xml:space="preserve"> </w:t>
-      </w:r>
-      <w:proofErr w:type="spellStart"/>
-      <w:r>
-        <w:rPr>
-          <w:rFonts w:ascii="Arial" w:eastAsia="Times New Roman" w:hAnsi="Arial" w:cs="Arial"/>
-          <w:b/>
-          <w:bCs/>
-          <w:color w:val="1F2328"/>
-          <w:kern w:val="0"/>
-          <w:sz w:val="20"/>
-          <w:szCs w:val="20"/>
-          <w:lang w:eastAsia="es-ES_tradnl"/>
-          <w14:ligatures w14:val="none"/>
-        </w:rPr>
-        <w:t>Group</w:t>
-      </w:r>
-      <w:proofErr w:type="spellEnd"/>
-      <w:r>
-        <w:rPr>
-          <w:rFonts w:ascii="Arial" w:eastAsia="Times New Roman" w:hAnsi="Arial" w:cs="Arial"/>
-          <w:b/>
-          <w:bCs/>
-          <w:color w:val="1F2328"/>
-          <w:kern w:val="0"/>
-          <w:sz w:val="20"/>
-          <w:szCs w:val="20"/>
-          <w:lang w:eastAsia="es-ES_tradnl"/>
-          <w14:ligatures w14:val="none"/>
-        </w:rPr>
-        <w:t xml:space="preserve"> </w:t>
-      </w:r>
-      <w:proofErr w:type="spellStart"/>
-      <w:r>
-        <w:rPr>
-          <w:rFonts w:ascii="Arial" w:eastAsia="Times New Roman" w:hAnsi="Arial" w:cs="Arial"/>
-          <w:b/>
-          <w:bCs/>
-          <w:color w:val="1F2328"/>
-          <w:kern w:val="0"/>
-          <w:sz w:val="20"/>
-          <w:szCs w:val="20"/>
-          <w:lang w:eastAsia="es-ES_tradnl"/>
-          <w14:ligatures w14:val="none"/>
-        </w:rPr>
-        <w:t>Members</w:t>
-      </w:r>
-      <w:proofErr w:type="spellEnd"/>
+        <w:t>. Working Group Members</w:t>
+      </w:r>
     </w:p>
     <w:p>
       <w:pPr>
@@ -2849,8 +2617,8 @@
         <w:tblLook w:val="04A0" w:firstRow="1" w:lastRow="0" w:firstColumn="1" w:lastColumn="0" w:noHBand="0" w:noVBand="1"/>
       </w:tblPr>
       <w:tblGrid>
-        <w:gridCol w:w="4344"/>
-        <w:gridCol w:w="4160"/>
+        <w:gridCol w:w="4243"/>
+        <w:gridCol w:w="4242"/>
       </w:tblGrid>
       <w:tr>
         <w:tc>
@@ -2919,67 +2687,6 @@
             <w:r>
               <w:rPr>
                 <w:rFonts w:ascii="Arial" w:eastAsia="Times New Roman" w:hAnsi="Arial" w:cs="Arial"/>
-                <w:noProof/>
-                <w:color w:val="000000"/>
-                <w:kern w:val="0"/>
-                <w:sz w:val="20"/>
-                <w:szCs w:val="20"/>
-                <w:bdr w:val="none" w:sz="0" w:space="0" w:color="auto" w:frame="1"/>
-                <w:lang w:eastAsia="es-ES_tradnl"/>
-                <w14:ligatures w14:val="none"/>
-              </w:rPr>
-              <w:drawing>
-                <wp:inline distT="0" distB="0" distL="0" distR="0" wp14:anchorId="190B84F9" wp14:editId="73B14F4F">
-                  <wp:extent cx="3062885" cy="4081882"/>
-                  <wp:effectExtent l="0" t="0" r="0" b="0"/>
-                  <wp:docPr id="751182374" name="Imagen 5" descr="Hombre caminando al lado de un edificio&#10;&#10;El contenido generado por IA puede ser incorrecto."/>
-                  <wp:cNvGraphicFramePr>
-                    <a:graphicFrameLocks xmlns:a="http://schemas.openxmlformats.org/drawingml/2006/main" noChangeAspect="1"/>
-                  </wp:cNvGraphicFramePr>
-                  <a:graphic xmlns:a="http://schemas.openxmlformats.org/drawingml/2006/main">
-                    <a:graphicData uri="http://schemas.openxmlformats.org/drawingml/2006/picture">
-                      <pic:pic xmlns:pic="http://schemas.openxmlformats.org/drawingml/2006/picture">
-                        <pic:nvPicPr>
-                          <pic:cNvPr id="751182374" name="Imagen 5" descr="Hombre caminando al lado de un edificio&#10;&#10;El contenido generado por IA puede ser incorrecto."/>
-                          <pic:cNvPicPr>
-                            <a:picLocks noChangeAspect="1" noChangeArrowheads="1"/>
-                          </pic:cNvPicPr>
-                        </pic:nvPicPr>
-                        <pic:blipFill>
-                          <a:blip r:embed="rId7" cstate="print">
-                            <a:extLst>
-                              <a:ext uri="{28A0092B-C50C-407E-A947-70E740481C1C}">
-                                <a14:useLocalDpi xmlns:a14="http://schemas.microsoft.com/office/drawing/2010/main" val="0"/>
-                              </a:ext>
-                            </a:extLst>
-                          </a:blip>
-                          <a:srcRect/>
-                          <a:stretch>
-                            <a:fillRect/>
-                          </a:stretch>
-                        </pic:blipFill>
-                        <pic:spPr bwMode="auto">
-                          <a:xfrm>
-                            <a:off x="0" y="0"/>
-                            <a:ext cx="3096894" cy="4127206"/>
-                          </a:xfrm>
-                          <a:prstGeom prst="rect">
-                            <a:avLst/>
-                          </a:prstGeom>
-                          <a:noFill/>
-                          <a:ln>
-                            <a:noFill/>
-                          </a:ln>
-                        </pic:spPr>
-                      </pic:pic>
-                    </a:graphicData>
-                  </a:graphic>
-                </wp:inline>
-              </w:drawing>
-            </w:r>
-            <w:r>
-              <w:rPr>
-                <w:rFonts w:ascii="Arial" w:eastAsia="Times New Roman" w:hAnsi="Arial" w:cs="Arial"/>
                 <w:color w:val="000000"/>
                 <w:kern w:val="0"/>
                 <w:sz w:val="20"/>
@@ -2989,69 +2696,6 @@
                 <w14:ligatures w14:val="none"/>
               </w:rPr>
               <w:fldChar w:fldCharType="end"/>
-            </w:r>
-          </w:p>
-          <w:p>
-            <w:pPr>
-              <w:spacing w:after="0" w:line="240" w:lineRule="auto"/>
-              <w:jc w:val="center"/>
-              <w:rPr>
-                <w:rFonts w:ascii="Arial" w:eastAsia="Times New Roman" w:hAnsi="Arial" w:cs="Arial"/>
-                <w:kern w:val="0"/>
-                <w:sz w:val="20"/>
-                <w:szCs w:val="20"/>
-                <w:lang w:eastAsia="es-ES_tradnl"/>
-                <w14:ligatures w14:val="none"/>
-              </w:rPr>
-            </w:pPr>
-            <w:r>
-              <w:rPr>
-                <w:rFonts w:ascii="Arial" w:eastAsia="Times New Roman" w:hAnsi="Arial" w:cs="Arial"/>
-                <w:color w:val="000000"/>
-                <w:kern w:val="0"/>
-                <w:sz w:val="20"/>
-                <w:szCs w:val="20"/>
-                <w:lang w:eastAsia="es-ES_tradnl"/>
-                <w14:ligatures w14:val="none"/>
-              </w:rPr>
-              <w:t>Jesús</w:t>
-            </w:r>
-            <w:r>
-              <w:rPr>
-                <w:rFonts w:ascii="Arial" w:eastAsia="Times New Roman" w:hAnsi="Arial" w:cs="Arial"/>
-                <w:color w:val="000000"/>
-                <w:kern w:val="0"/>
-                <w:sz w:val="20"/>
-                <w:szCs w:val="20"/>
-                <w:lang w:eastAsia="es-ES_tradnl"/>
-                <w14:ligatures w14:val="none"/>
-              </w:rPr>
-              <w:t xml:space="preserve"> Villalba </w:t>
-            </w:r>
-            <w:r>
-              <w:rPr>
-                <w:rFonts w:ascii="Arial" w:eastAsia="Times New Roman" w:hAnsi="Arial" w:cs="Arial"/>
-                <w:color w:val="000000"/>
-                <w:kern w:val="0"/>
-                <w:sz w:val="20"/>
-                <w:szCs w:val="20"/>
-                <w:lang w:eastAsia="es-ES_tradnl"/>
-                <w14:ligatures w14:val="none"/>
-              </w:rPr>
-              <w:t>Fernández</w:t>
-            </w:r>
-            <w:r>
-              <w:rPr>
-                <w:rFonts w:ascii="Arial" w:eastAsia="Times New Roman" w:hAnsi="Arial" w:cs="Arial"/>
-                <w:color w:val="000000"/>
-                <w:kern w:val="0"/>
-                <w:sz w:val="20"/>
-                <w:szCs w:val="20"/>
-                <w:lang w:eastAsia="es-ES_tradnl"/>
-                <w14:ligatures w14:val="none"/>
-              </w:rPr>
-              <w:br/>
-              <w:t>jesvilfer@alum.us.es</w:t>
             </w:r>
           </w:p>
         </w:tc>
@@ -3121,67 +2765,6 @@
             <w:r>
               <w:rPr>
                 <w:rFonts w:ascii="Arial" w:eastAsia="Times New Roman" w:hAnsi="Arial" w:cs="Arial"/>
-                <w:noProof/>
-                <w:color w:val="000000"/>
-                <w:kern w:val="0"/>
-                <w:sz w:val="20"/>
-                <w:szCs w:val="20"/>
-                <w:bdr w:val="none" w:sz="0" w:space="0" w:color="auto" w:frame="1"/>
-                <w:lang w:eastAsia="es-ES_tradnl"/>
-                <w14:ligatures w14:val="none"/>
-              </w:rPr>
-              <w:drawing>
-                <wp:inline distT="0" distB="0" distL="0" distR="0" wp14:anchorId="69F90A83" wp14:editId="5F177F0B">
-                  <wp:extent cx="2926660" cy="4081780"/>
-                  <wp:effectExtent l="0" t="0" r="0" b="0"/>
-                  <wp:docPr id="1444577329" name="Imagen 4" descr="Cabeza y torso de un hombre con sombrero&#10;&#10;El contenido generado por IA puede ser incorrecto."/>
-                  <wp:cNvGraphicFramePr>
-                    <a:graphicFrameLocks xmlns:a="http://schemas.openxmlformats.org/drawingml/2006/main" noChangeAspect="1"/>
-                  </wp:cNvGraphicFramePr>
-                  <a:graphic xmlns:a="http://schemas.openxmlformats.org/drawingml/2006/main">
-                    <a:graphicData uri="http://schemas.openxmlformats.org/drawingml/2006/picture">
-                      <pic:pic xmlns:pic="http://schemas.openxmlformats.org/drawingml/2006/picture">
-                        <pic:nvPicPr>
-                          <pic:cNvPr id="1444577329" name="Imagen 4" descr="Cabeza y torso de un hombre con sombrero&#10;&#10;El contenido generado por IA puede ser incorrecto."/>
-                          <pic:cNvPicPr>
-                            <a:picLocks noChangeAspect="1" noChangeArrowheads="1"/>
-                          </pic:cNvPicPr>
-                        </pic:nvPicPr>
-                        <pic:blipFill>
-                          <a:blip r:embed="rId8">
-                            <a:extLst>
-                              <a:ext uri="{28A0092B-C50C-407E-A947-70E740481C1C}">
-                                <a14:useLocalDpi xmlns:a14="http://schemas.microsoft.com/office/drawing/2010/main" val="0"/>
-                              </a:ext>
-                            </a:extLst>
-                          </a:blip>
-                          <a:srcRect/>
-                          <a:stretch>
-                            <a:fillRect/>
-                          </a:stretch>
-                        </pic:blipFill>
-                        <pic:spPr bwMode="auto">
-                          <a:xfrm>
-                            <a:off x="0" y="0"/>
-                            <a:ext cx="2966919" cy="4137929"/>
-                          </a:xfrm>
-                          <a:prstGeom prst="rect">
-                            <a:avLst/>
-                          </a:prstGeom>
-                          <a:noFill/>
-                          <a:ln>
-                            <a:noFill/>
-                          </a:ln>
-                        </pic:spPr>
-                      </pic:pic>
-                    </a:graphicData>
-                  </a:graphic>
-                </wp:inline>
-              </w:drawing>
-            </w:r>
-            <w:r>
-              <w:rPr>
-                <w:rFonts w:ascii="Arial" w:eastAsia="Times New Roman" w:hAnsi="Arial" w:cs="Arial"/>
                 <w:color w:val="000000"/>
                 <w:kern w:val="0"/>
                 <w:sz w:val="20"/>
@@ -3191,68 +2774,6 @@
                 <w14:ligatures w14:val="none"/>
               </w:rPr>
               <w:fldChar w:fldCharType="end"/>
-            </w:r>
-            <w:r>
-              <w:rPr>
-                <w:rFonts w:ascii="Arial" w:eastAsia="Times New Roman" w:hAnsi="Arial" w:cs="Arial"/>
-                <w:color w:val="000000"/>
-                <w:kern w:val="0"/>
-                <w:sz w:val="20"/>
-                <w:szCs w:val="20"/>
-                <w:lang w:eastAsia="es-ES_tradnl"/>
-                <w14:ligatures w14:val="none"/>
-              </w:rPr>
-              <w:br/>
-              <w:t xml:space="preserve">Juan </w:t>
-            </w:r>
-            <w:r>
-              <w:rPr>
-                <w:rFonts w:ascii="Arial" w:eastAsia="Times New Roman" w:hAnsi="Arial" w:cs="Arial"/>
-                <w:color w:val="000000"/>
-                <w:kern w:val="0"/>
-                <w:sz w:val="20"/>
-                <w:szCs w:val="20"/>
-                <w:lang w:eastAsia="es-ES_tradnl"/>
-                <w14:ligatures w14:val="none"/>
-              </w:rPr>
-              <w:t>Ramírez</w:t>
-            </w:r>
-            <w:r>
-              <w:rPr>
-                <w:rFonts w:ascii="Arial" w:eastAsia="Times New Roman" w:hAnsi="Arial" w:cs="Arial"/>
-                <w:color w:val="000000"/>
-                <w:kern w:val="0"/>
-                <w:sz w:val="20"/>
-                <w:szCs w:val="20"/>
-                <w:lang w:eastAsia="es-ES_tradnl"/>
-                <w14:ligatures w14:val="none"/>
-              </w:rPr>
-              <w:t xml:space="preserve"> Morales</w:t>
-            </w:r>
-            <w:r>
-              <w:rPr>
-                <w:rFonts w:ascii="Arial" w:eastAsia="Times New Roman" w:hAnsi="Arial" w:cs="Arial"/>
-                <w:color w:val="000000"/>
-                <w:kern w:val="0"/>
-                <w:sz w:val="20"/>
-                <w:szCs w:val="20"/>
-                <w:lang w:eastAsia="es-ES_tradnl"/>
-                <w14:ligatures w14:val="none"/>
-              </w:rPr>
-              <w:br/>
-            </w:r>
-            <w:r>
-              <w:rPr>
-                <w:rFonts w:ascii="Arial" w:eastAsia="Times New Roman" w:hAnsi="Arial" w:cs="Arial"/>
-                <w:color w:val="000000"/>
-                <w:kern w:val="0"/>
-                <w:sz w:val="20"/>
-                <w:szCs w:val="20"/>
-                <w:shd w:val="clear" w:color="auto" w:fill="F6F8FA"/>
-                <w:lang w:eastAsia="es-ES_tradnl"/>
-                <w14:ligatures w14:val="none"/>
-              </w:rPr>
-              <w:t>juarammor2@alum.us.es</w:t>
             </w:r>
           </w:p>
         </w:tc>
@@ -3293,7 +2814,6 @@
                 <w:lang w:eastAsia="es-ES_tradnl"/>
                 <w14:ligatures w14:val="none"/>
               </w:rPr>
-              <w:lastRenderedPageBreak/>
               <w:fldChar w:fldCharType="begin"/>
             </w:r>
             <w:r>
@@ -3352,7 +2872,7 @@
                           </pic:cNvPicPr>
                         </pic:nvPicPr>
                         <pic:blipFill>
-                          <a:blip r:embed="rId9" cstate="print">
+                          <a:blip r:embed="rId7" cstate="print">
                             <a:extLst>
                               <a:ext uri="{28A0092B-C50C-407E-A947-70E740481C1C}">
                                 <a14:useLocalDpi xmlns:a14="http://schemas.microsoft.com/office/drawing/2010/main" val="0"/>
@@ -3542,7 +3062,7 @@
                           </pic:cNvPicPr>
                         </pic:nvPicPr>
                         <pic:blipFill>
-                          <a:blip r:embed="rId10" cstate="print">
+                          <a:blip r:embed="rId8" cstate="print">
                             <a:extLst>
                               <a:ext uri="{28A0092B-C50C-407E-A947-70E740481C1C}">
                                 <a14:useLocalDpi xmlns:a14="http://schemas.microsoft.com/office/drawing/2010/main" val="0"/>
@@ -3691,6 +3211,7 @@
                 <w:lang w:eastAsia="es-ES_tradnl"/>
                 <w14:ligatures w14:val="none"/>
               </w:rPr>
+              <w:lastRenderedPageBreak/>
               <w:fldChar w:fldCharType="begin"/>
             </w:r>
             <w:r>
@@ -3732,9 +3253,9 @@
                 <w14:ligatures w14:val="none"/>
               </w:rPr>
               <w:drawing>
-                <wp:inline distT="0" distB="0" distL="0" distR="0" wp14:anchorId="29A77D8E" wp14:editId="2371B69E">
-                  <wp:extent cx="2487168" cy="2567259"/>
-                  <wp:effectExtent l="0" t="0" r="2540" b="0"/>
+                <wp:inline distT="0" distB="0" distL="0" distR="0" wp14:anchorId="29A77D8E" wp14:editId="4E5F94E3">
+                  <wp:extent cx="2381250" cy="2457930"/>
+                  <wp:effectExtent l="0" t="0" r="0" b="0"/>
                   <wp:docPr id="1433375843" name="Imagen 1" descr="Un joven sonriendo con una playera de color gris&#10;&#10;El contenido generado por IA puede ser incorrecto."/>
                   <wp:cNvGraphicFramePr>
                     <a:graphicFrameLocks xmlns:a="http://schemas.openxmlformats.org/drawingml/2006/main" noChangeAspect="1"/>
@@ -3749,7 +3270,7 @@
                           </pic:cNvPicPr>
                         </pic:nvPicPr>
                         <pic:blipFill>
-                          <a:blip r:embed="rId11" cstate="print">
+                          <a:blip r:embed="rId9" cstate="print">
                             <a:extLst>
                               <a:ext uri="{28A0092B-C50C-407E-A947-70E740481C1C}">
                                 <a14:useLocalDpi xmlns:a14="http://schemas.microsoft.com/office/drawing/2010/main" val="0"/>
@@ -3764,7 +3285,7 @@
                         <pic:spPr bwMode="auto">
                           <a:xfrm>
                             <a:off x="0" y="0"/>
-                            <a:ext cx="2513514" cy="2594453"/>
+                            <a:ext cx="2409255" cy="2486837"/>
                           </a:xfrm>
                           <a:prstGeom prst="rect">
                             <a:avLst/>
@@ -4004,7 +3525,31 @@
           <w:lang w:val="en-US" w:eastAsia="es-ES_tradnl"/>
           <w14:ligatures w14:val="none"/>
         </w:rPr>
-        <w:t>We, the members of group C1.033, commit to working together in the course Design and Testing 2. We declare that we have understood the syllabus, with a special focus on the evaluation and grading procedures, and we commit to achieving the following grade: 8.</w:t>
+        <w:t>We, the members of group C</w:t>
+      </w:r>
+      <w:r>
+        <w:rPr>
+          <w:rFonts w:ascii="Arial" w:eastAsia="Times New Roman" w:hAnsi="Arial" w:cs="Arial"/>
+          <w:color w:val="1F2328"/>
+          <w:kern w:val="0"/>
+          <w:sz w:val="20"/>
+          <w:szCs w:val="20"/>
+          <w:lang w:val="en-US" w:eastAsia="es-ES_tradnl"/>
+          <w14:ligatures w14:val="none"/>
+        </w:rPr>
+        <w:t>2</w:t>
+      </w:r>
+      <w:r>
+        <w:rPr>
+          <w:rFonts w:ascii="Arial" w:eastAsia="Times New Roman" w:hAnsi="Arial" w:cs="Arial"/>
+          <w:color w:val="1F2328"/>
+          <w:kern w:val="0"/>
+          <w:sz w:val="20"/>
+          <w:szCs w:val="20"/>
+          <w:lang w:val="en-US" w:eastAsia="es-ES_tradnl"/>
+          <w14:ligatures w14:val="none"/>
+        </w:rPr>
+        <w:t>.033, commit to working together in the course Design and Testing 2. We declare that we have understood the syllabus, with a special focus on the evaluation and grading procedures, and we commit to achieving the following grade: 8.</w:t>
       </w:r>
     </w:p>
     <w:p>
@@ -4033,7 +3578,7 @@
           <w:kern w:val="0"/>
           <w:sz w:val="20"/>
           <w:szCs w:val="20"/>
-          <w:lang w:eastAsia="es-ES_tradnl"/>
+          <w:lang w:val="en-GB" w:eastAsia="es-ES_tradnl"/>
           <w14:ligatures w14:val="none"/>
         </w:rPr>
       </w:pPr>
@@ -4051,7 +3596,7 @@
           <w:kern w:val="0"/>
           <w:sz w:val="20"/>
           <w:szCs w:val="20"/>
-          <w:lang w:eastAsia="es-ES_tradnl"/>
+          <w:lang w:val="en-GB" w:eastAsia="es-ES_tradnl"/>
           <w14:ligatures w14:val="none"/>
         </w:rPr>
       </w:pPr>
@@ -4085,7 +3630,6 @@
           <w:lang w:eastAsia="es-ES_tradnl"/>
           <w14:ligatures w14:val="none"/>
         </w:rPr>
-        <w:lastRenderedPageBreak/>
         <w:t>7</w:t>
       </w:r>
       <w:r>
@@ -4100,24 +3644,8 @@
           <w:lang w:eastAsia="es-ES_tradnl"/>
           <w14:ligatures w14:val="none"/>
         </w:rPr>
-        <w:t xml:space="preserve">. Performance </w:t>
-      </w:r>
-      <w:proofErr w:type="spellStart"/>
-      <w:r>
-        <w:rPr>
-          <w:rFonts w:ascii="Arial" w:eastAsia="Times New Roman" w:hAnsi="Arial" w:cs="Arial"/>
-          <w:b/>
-          <w:bCs/>
-          <w:color w:val="1F2328"/>
-          <w:kern w:val="0"/>
-          <w:sz w:val="20"/>
-          <w:szCs w:val="20"/>
-          <w:lang w:eastAsia="es-ES_tradnl"/>
-          <w14:ligatures w14:val="none"/>
-        </w:rPr>
-        <w:t>Indicators</w:t>
-      </w:r>
-      <w:proofErr w:type="spellEnd"/>
+        <w:t>. Performance Indicators</w:t>
+      </w:r>
     </w:p>
     <w:p>
       <w:pPr>
@@ -4494,6 +4022,7 @@
           <w:lang w:val="en-US" w:eastAsia="es-ES_tradnl"/>
           <w14:ligatures w14:val="none"/>
         </w:rPr>
+        <w:lastRenderedPageBreak/>
         <w:t>9</w:t>
       </w:r>
       <w:r>
@@ -4656,33 +4185,7 @@
           <w:lang w:val="en-US" w:eastAsia="es-ES_tradnl"/>
           <w14:ligatures w14:val="none"/>
         </w:rPr>
-        <w:t xml:space="preserve">(This system follows a similar structure to soccer cards: the first two warnings correspond to yellow cards, while the third results in expulsion, </w:t>
-      </w:r>
-      <w:proofErr w:type="gramStart"/>
-      <w:r>
-        <w:rPr>
-          <w:rFonts w:ascii="Arial" w:eastAsia="Times New Roman" w:hAnsi="Arial" w:cs="Arial"/>
-          <w:color w:val="1F2328"/>
-          <w:kern w:val="0"/>
-          <w:sz w:val="20"/>
-          <w:szCs w:val="20"/>
-          <w:lang w:val="en-US" w:eastAsia="es-ES_tradnl"/>
-          <w14:ligatures w14:val="none"/>
-        </w:rPr>
-        <w:t>similar to</w:t>
-      </w:r>
-      <w:proofErr w:type="gramEnd"/>
-      <w:r>
-        <w:rPr>
-          <w:rFonts w:ascii="Arial" w:eastAsia="Times New Roman" w:hAnsi="Arial" w:cs="Arial"/>
-          <w:color w:val="1F2328"/>
-          <w:kern w:val="0"/>
-          <w:sz w:val="20"/>
-          <w:szCs w:val="20"/>
-          <w:lang w:val="en-US" w:eastAsia="es-ES_tradnl"/>
-          <w14:ligatures w14:val="none"/>
-        </w:rPr>
-        <w:t xml:space="preserve"> a red card.)</w:t>
+        <w:t>(This system follows a similar structure to soccer cards: the first two warnings correspond to yellow cards, while the third results in expulsion, similar to a red card.)</w:t>
       </w:r>
     </w:p>
     <w:p>
@@ -4853,7 +4356,6 @@
           <w14:ligatures w14:val="none"/>
         </w:rPr>
       </w:pPr>
-      <w:proofErr w:type="spellStart"/>
       <w:r>
         <w:rPr>
           <w:rFonts w:ascii="Arial" w:eastAsia="Times New Roman" w:hAnsi="Arial" w:cs="Arial"/>
@@ -4864,98 +4366,7 @@
           <w:lang w:eastAsia="es-ES_tradnl"/>
           <w14:ligatures w14:val="none"/>
         </w:rPr>
-        <w:t>Unnecessary</w:t>
-      </w:r>
-      <w:proofErr w:type="spellEnd"/>
-      <w:r>
-        <w:rPr>
-          <w:rFonts w:ascii="Arial" w:eastAsia="Times New Roman" w:hAnsi="Arial" w:cs="Arial"/>
-          <w:color w:val="1F2328"/>
-          <w:kern w:val="0"/>
-          <w:sz w:val="20"/>
-          <w:szCs w:val="20"/>
-          <w:lang w:eastAsia="es-ES_tradnl"/>
-          <w14:ligatures w14:val="none"/>
-        </w:rPr>
-        <w:t xml:space="preserve"> </w:t>
-      </w:r>
-      <w:proofErr w:type="spellStart"/>
-      <w:r>
-        <w:rPr>
-          <w:rFonts w:ascii="Arial" w:eastAsia="Times New Roman" w:hAnsi="Arial" w:cs="Arial"/>
-          <w:color w:val="1F2328"/>
-          <w:kern w:val="0"/>
-          <w:sz w:val="20"/>
-          <w:szCs w:val="20"/>
-          <w:lang w:eastAsia="es-ES_tradnl"/>
-          <w14:ligatures w14:val="none"/>
-        </w:rPr>
-        <w:t>or</w:t>
-      </w:r>
-      <w:proofErr w:type="spellEnd"/>
-      <w:r>
-        <w:rPr>
-          <w:rFonts w:ascii="Arial" w:eastAsia="Times New Roman" w:hAnsi="Arial" w:cs="Arial"/>
-          <w:color w:val="1F2328"/>
-          <w:kern w:val="0"/>
-          <w:sz w:val="20"/>
-          <w:szCs w:val="20"/>
-          <w:lang w:eastAsia="es-ES_tradnl"/>
-          <w14:ligatures w14:val="none"/>
-        </w:rPr>
-        <w:t xml:space="preserve"> </w:t>
-      </w:r>
-      <w:proofErr w:type="spellStart"/>
-      <w:r>
-        <w:rPr>
-          <w:rFonts w:ascii="Arial" w:eastAsia="Times New Roman" w:hAnsi="Arial" w:cs="Arial"/>
-          <w:color w:val="1F2328"/>
-          <w:kern w:val="0"/>
-          <w:sz w:val="20"/>
-          <w:szCs w:val="20"/>
-          <w:lang w:eastAsia="es-ES_tradnl"/>
-          <w14:ligatures w14:val="none"/>
-        </w:rPr>
-        <w:t>insufficient</w:t>
-      </w:r>
-      <w:proofErr w:type="spellEnd"/>
-      <w:r>
-        <w:rPr>
-          <w:rFonts w:ascii="Arial" w:eastAsia="Times New Roman" w:hAnsi="Arial" w:cs="Arial"/>
-          <w:color w:val="1F2328"/>
-          <w:kern w:val="0"/>
-          <w:sz w:val="20"/>
-          <w:szCs w:val="20"/>
-          <w:lang w:eastAsia="es-ES_tradnl"/>
-          <w14:ligatures w14:val="none"/>
-        </w:rPr>
-        <w:t xml:space="preserve"> </w:t>
-      </w:r>
-      <w:proofErr w:type="spellStart"/>
-      <w:r>
-        <w:rPr>
-          <w:rFonts w:ascii="Arial" w:eastAsia="Times New Roman" w:hAnsi="Arial" w:cs="Arial"/>
-          <w:color w:val="1F2328"/>
-          <w:kern w:val="0"/>
-          <w:sz w:val="20"/>
-          <w:szCs w:val="20"/>
-          <w:lang w:eastAsia="es-ES_tradnl"/>
-          <w14:ligatures w14:val="none"/>
-        </w:rPr>
-        <w:t>work</w:t>
-      </w:r>
-      <w:proofErr w:type="spellEnd"/>
-      <w:r>
-        <w:rPr>
-          <w:rFonts w:ascii="Arial" w:eastAsia="Times New Roman" w:hAnsi="Arial" w:cs="Arial"/>
-          <w:color w:val="1F2328"/>
-          <w:kern w:val="0"/>
-          <w:sz w:val="20"/>
-          <w:szCs w:val="20"/>
-          <w:lang w:eastAsia="es-ES_tradnl"/>
-          <w14:ligatures w14:val="none"/>
-        </w:rPr>
-        <w:t>.</w:t>
+        <w:t>Unnecessary or insufficient work.</w:t>
       </w:r>
     </w:p>
     <w:p>
@@ -4971,7 +4382,6 @@
           <w14:ligatures w14:val="none"/>
         </w:rPr>
       </w:pPr>
-      <w:proofErr w:type="spellStart"/>
       <w:r>
         <w:rPr>
           <w:rFonts w:ascii="Arial" w:eastAsia="Times New Roman" w:hAnsi="Arial" w:cs="Arial"/>
@@ -4982,72 +4392,7 @@
           <w:lang w:eastAsia="es-ES_tradnl"/>
           <w14:ligatures w14:val="none"/>
         </w:rPr>
-        <w:t>Options</w:t>
-      </w:r>
-      <w:proofErr w:type="spellEnd"/>
-      <w:r>
-        <w:rPr>
-          <w:rFonts w:ascii="Arial" w:eastAsia="Times New Roman" w:hAnsi="Arial" w:cs="Arial"/>
-          <w:color w:val="1F2328"/>
-          <w:kern w:val="0"/>
-          <w:sz w:val="20"/>
-          <w:szCs w:val="20"/>
-          <w:lang w:eastAsia="es-ES_tradnl"/>
-          <w14:ligatures w14:val="none"/>
-        </w:rPr>
-        <w:t xml:space="preserve"> after </w:t>
-      </w:r>
-      <w:proofErr w:type="spellStart"/>
-      <w:r>
-        <w:rPr>
-          <w:rFonts w:ascii="Arial" w:eastAsia="Times New Roman" w:hAnsi="Arial" w:cs="Arial"/>
-          <w:color w:val="1F2328"/>
-          <w:kern w:val="0"/>
-          <w:sz w:val="20"/>
-          <w:szCs w:val="20"/>
-          <w:lang w:eastAsia="es-ES_tradnl"/>
-          <w14:ligatures w14:val="none"/>
-        </w:rPr>
-        <w:t>being</w:t>
-      </w:r>
-      <w:proofErr w:type="spellEnd"/>
-      <w:r>
-        <w:rPr>
-          <w:rFonts w:ascii="Arial" w:eastAsia="Times New Roman" w:hAnsi="Arial" w:cs="Arial"/>
-          <w:color w:val="1F2328"/>
-          <w:kern w:val="0"/>
-          <w:sz w:val="20"/>
-          <w:szCs w:val="20"/>
-          <w:lang w:eastAsia="es-ES_tradnl"/>
-          <w14:ligatures w14:val="none"/>
-        </w:rPr>
-        <w:t xml:space="preserve"> </w:t>
-      </w:r>
-      <w:proofErr w:type="spellStart"/>
-      <w:r>
-        <w:rPr>
-          <w:rFonts w:ascii="Arial" w:eastAsia="Times New Roman" w:hAnsi="Arial" w:cs="Arial"/>
-          <w:color w:val="1F2328"/>
-          <w:kern w:val="0"/>
-          <w:sz w:val="20"/>
-          <w:szCs w:val="20"/>
-          <w:lang w:eastAsia="es-ES_tradnl"/>
-          <w14:ligatures w14:val="none"/>
-        </w:rPr>
-        <w:t>dismissed</w:t>
-      </w:r>
-      <w:proofErr w:type="spellEnd"/>
-      <w:r>
-        <w:rPr>
-          <w:rFonts w:ascii="Arial" w:eastAsia="Times New Roman" w:hAnsi="Arial" w:cs="Arial"/>
-          <w:color w:val="1F2328"/>
-          <w:kern w:val="0"/>
-          <w:sz w:val="20"/>
-          <w:szCs w:val="20"/>
-          <w:lang w:eastAsia="es-ES_tradnl"/>
-          <w14:ligatures w14:val="none"/>
-        </w:rPr>
-        <w:t>:</w:t>
+        <w:t>Options after being dismissed:</w:t>
       </w:r>
     </w:p>
     <w:p>
@@ -5079,33 +4424,7 @@
           <w:lang w:eastAsia="es-ES_tradnl"/>
           <w14:ligatures w14:val="none"/>
         </w:rPr>
-        <w:t xml:space="preserve">Continue </w:t>
-      </w:r>
-      <w:proofErr w:type="spellStart"/>
-      <w:r>
-        <w:rPr>
-          <w:rFonts w:ascii="Arial" w:eastAsia="Times New Roman" w:hAnsi="Arial" w:cs="Arial"/>
-          <w:color w:val="1F2328"/>
-          <w:kern w:val="0"/>
-          <w:sz w:val="20"/>
-          <w:szCs w:val="20"/>
-          <w:lang w:eastAsia="es-ES_tradnl"/>
-          <w14:ligatures w14:val="none"/>
-        </w:rPr>
-        <w:t>working</w:t>
-      </w:r>
-      <w:proofErr w:type="spellEnd"/>
-      <w:r>
-        <w:rPr>
-          <w:rFonts w:ascii="Arial" w:eastAsia="Times New Roman" w:hAnsi="Arial" w:cs="Arial"/>
-          <w:color w:val="1F2328"/>
-          <w:kern w:val="0"/>
-          <w:sz w:val="20"/>
-          <w:szCs w:val="20"/>
-          <w:lang w:eastAsia="es-ES_tradnl"/>
-          <w14:ligatures w14:val="none"/>
-        </w:rPr>
-        <w:t xml:space="preserve"> alone.</w:t>
+        <w:t>Continue working alone.</w:t>
       </w:r>
     </w:p>
     <w:p>
@@ -5127,7 +4446,6 @@
           <w14:ligatures w14:val="none"/>
         </w:rPr>
       </w:pPr>
-      <w:proofErr w:type="spellStart"/>
       <w:r>
         <w:rPr>
           <w:rFonts w:ascii="Arial" w:eastAsia="Times New Roman" w:hAnsi="Arial" w:cs="Arial"/>
@@ -5138,72 +4456,7 @@
           <w:lang w:eastAsia="es-ES_tradnl"/>
           <w14:ligatures w14:val="none"/>
         </w:rPr>
-        <w:t>Drop</w:t>
-      </w:r>
-      <w:proofErr w:type="spellEnd"/>
-      <w:r>
-        <w:rPr>
-          <w:rFonts w:ascii="Arial" w:eastAsia="Times New Roman" w:hAnsi="Arial" w:cs="Arial"/>
-          <w:color w:val="1F2328"/>
-          <w:kern w:val="0"/>
-          <w:sz w:val="20"/>
-          <w:szCs w:val="20"/>
-          <w:lang w:eastAsia="es-ES_tradnl"/>
-          <w14:ligatures w14:val="none"/>
-        </w:rPr>
-        <w:t xml:space="preserve"> </w:t>
-      </w:r>
-      <w:proofErr w:type="spellStart"/>
-      <w:r>
-        <w:rPr>
-          <w:rFonts w:ascii="Arial" w:eastAsia="Times New Roman" w:hAnsi="Arial" w:cs="Arial"/>
-          <w:color w:val="1F2328"/>
-          <w:kern w:val="0"/>
-          <w:sz w:val="20"/>
-          <w:szCs w:val="20"/>
-          <w:lang w:eastAsia="es-ES_tradnl"/>
-          <w14:ligatures w14:val="none"/>
-        </w:rPr>
-        <w:t>the</w:t>
-      </w:r>
-      <w:proofErr w:type="spellEnd"/>
-      <w:r>
-        <w:rPr>
-          <w:rFonts w:ascii="Arial" w:eastAsia="Times New Roman" w:hAnsi="Arial" w:cs="Arial"/>
-          <w:color w:val="1F2328"/>
-          <w:kern w:val="0"/>
-          <w:sz w:val="20"/>
-          <w:szCs w:val="20"/>
-          <w:lang w:eastAsia="es-ES_tradnl"/>
-          <w14:ligatures w14:val="none"/>
-        </w:rPr>
-        <w:t xml:space="preserve"> </w:t>
-      </w:r>
-      <w:proofErr w:type="spellStart"/>
-      <w:r>
-        <w:rPr>
-          <w:rFonts w:ascii="Arial" w:eastAsia="Times New Roman" w:hAnsi="Arial" w:cs="Arial"/>
-          <w:color w:val="1F2328"/>
-          <w:kern w:val="0"/>
-          <w:sz w:val="20"/>
-          <w:szCs w:val="20"/>
-          <w:lang w:eastAsia="es-ES_tradnl"/>
-          <w14:ligatures w14:val="none"/>
-        </w:rPr>
-        <w:t>course</w:t>
-      </w:r>
-      <w:proofErr w:type="spellEnd"/>
-      <w:r>
-        <w:rPr>
-          <w:rFonts w:ascii="Arial" w:eastAsia="Times New Roman" w:hAnsi="Arial" w:cs="Arial"/>
-          <w:color w:val="1F2328"/>
-          <w:kern w:val="0"/>
-          <w:sz w:val="20"/>
-          <w:szCs w:val="20"/>
-          <w:lang w:eastAsia="es-ES_tradnl"/>
-          <w14:ligatures w14:val="none"/>
-        </w:rPr>
-        <w:t>.</w:t>
+        <w:t>Drop the course.</w:t>
       </w:r>
     </w:p>
     <w:p>
@@ -5225,7 +4478,6 @@
           <w14:ligatures w14:val="none"/>
         </w:rPr>
       </w:pPr>
-      <w:proofErr w:type="spellStart"/>
       <w:r>
         <w:rPr>
           <w:rFonts w:ascii="Arial" w:eastAsia="Times New Roman" w:hAnsi="Arial" w:cs="Arial"/>
@@ -5236,72 +4488,7 @@
           <w:lang w:eastAsia="es-ES_tradnl"/>
           <w14:ligatures w14:val="none"/>
         </w:rPr>
-        <w:t>Find</w:t>
-      </w:r>
-      <w:proofErr w:type="spellEnd"/>
-      <w:r>
-        <w:rPr>
-          <w:rFonts w:ascii="Arial" w:eastAsia="Times New Roman" w:hAnsi="Arial" w:cs="Arial"/>
-          <w:color w:val="1F2328"/>
-          <w:kern w:val="0"/>
-          <w:sz w:val="20"/>
-          <w:szCs w:val="20"/>
-          <w:lang w:eastAsia="es-ES_tradnl"/>
-          <w14:ligatures w14:val="none"/>
-        </w:rPr>
-        <w:t xml:space="preserve"> </w:t>
-      </w:r>
-      <w:proofErr w:type="spellStart"/>
-      <w:r>
-        <w:rPr>
-          <w:rFonts w:ascii="Arial" w:eastAsia="Times New Roman" w:hAnsi="Arial" w:cs="Arial"/>
-          <w:color w:val="1F2328"/>
-          <w:kern w:val="0"/>
-          <w:sz w:val="20"/>
-          <w:szCs w:val="20"/>
-          <w:lang w:eastAsia="es-ES_tradnl"/>
-          <w14:ligatures w14:val="none"/>
-        </w:rPr>
-        <w:t>another</w:t>
-      </w:r>
-      <w:proofErr w:type="spellEnd"/>
-      <w:r>
-        <w:rPr>
-          <w:rFonts w:ascii="Arial" w:eastAsia="Times New Roman" w:hAnsi="Arial" w:cs="Arial"/>
-          <w:color w:val="1F2328"/>
-          <w:kern w:val="0"/>
-          <w:sz w:val="20"/>
-          <w:szCs w:val="20"/>
-          <w:lang w:eastAsia="es-ES_tradnl"/>
-          <w14:ligatures w14:val="none"/>
-        </w:rPr>
-        <w:t xml:space="preserve"> </w:t>
-      </w:r>
-      <w:proofErr w:type="spellStart"/>
-      <w:r>
-        <w:rPr>
-          <w:rFonts w:ascii="Arial" w:eastAsia="Times New Roman" w:hAnsi="Arial" w:cs="Arial"/>
-          <w:color w:val="1F2328"/>
-          <w:kern w:val="0"/>
-          <w:sz w:val="20"/>
-          <w:szCs w:val="20"/>
-          <w:lang w:eastAsia="es-ES_tradnl"/>
-          <w14:ligatures w14:val="none"/>
-        </w:rPr>
-        <w:t>group</w:t>
-      </w:r>
-      <w:proofErr w:type="spellEnd"/>
-      <w:r>
-        <w:rPr>
-          <w:rFonts w:ascii="Arial" w:eastAsia="Times New Roman" w:hAnsi="Arial" w:cs="Arial"/>
-          <w:color w:val="1F2328"/>
-          <w:kern w:val="0"/>
-          <w:sz w:val="20"/>
-          <w:szCs w:val="20"/>
-          <w:lang w:eastAsia="es-ES_tradnl"/>
-          <w14:ligatures w14:val="none"/>
-        </w:rPr>
-        <w:t>.</w:t>
+        <w:t>Find another group.</w:t>
       </w:r>
     </w:p>
     <w:p>
@@ -5419,7 +4606,6 @@
           <w:lang w:eastAsia="es-ES_tradnl"/>
           <w14:ligatures w14:val="none"/>
         </w:rPr>
-        <w:lastRenderedPageBreak/>
         <w:t>11</w:t>
       </w:r>
       <w:r>
@@ -5434,24 +4620,8 @@
           <w:lang w:eastAsia="es-ES_tradnl"/>
           <w14:ligatures w14:val="none"/>
         </w:rPr>
-        <w:t xml:space="preserve">. </w:t>
-      </w:r>
-      <w:proofErr w:type="spellStart"/>
-      <w:r>
-        <w:rPr>
-          <w:rFonts w:ascii="Arial" w:eastAsia="Times New Roman" w:hAnsi="Arial" w:cs="Arial"/>
-          <w:b/>
-          <w:bCs/>
-          <w:color w:val="1F2328"/>
-          <w:kern w:val="0"/>
-          <w:sz w:val="20"/>
-          <w:szCs w:val="20"/>
-          <w:lang w:eastAsia="es-ES_tradnl"/>
-          <w14:ligatures w14:val="none"/>
-        </w:rPr>
-        <w:t>Signatures</w:t>
-      </w:r>
-      <w:proofErr w:type="spellEnd"/>
+        <w:t>. Signatures</w:t>
+      </w:r>
     </w:p>
     <w:p>
       <w:pPr>
@@ -5549,6 +4719,7 @@
       <w:r>
         <w:rPr>
           <w:rFonts w:ascii="Arial" w:eastAsia="Times New Roman" w:hAnsi="Arial" w:cs="Arial"/>
+          <w:noProof/>
           <w:color w:val="000000"/>
           <w:kern w:val="0"/>
           <w:sz w:val="20"/>
@@ -5572,7 +4743,7 @@
                     <pic:cNvPicPr/>
                   </pic:nvPicPr>
                   <pic:blipFill>
-                    <a:blip r:embed="rId12"/>
+                    <a:blip r:embed="rId10"/>
                     <a:stretch>
                       <a:fillRect/>
                     </a:stretch>
@@ -5601,6 +4772,7 @@
       <w:r>
         <w:rPr>
           <w:rFonts w:ascii="Arial" w:eastAsia="Times New Roman" w:hAnsi="Arial" w:cs="Arial"/>
+          <w:noProof/>
           <w:color w:val="000000"/>
           <w:kern w:val="0"/>
           <w:sz w:val="20"/>
@@ -5624,7 +4796,7 @@
                     <pic:cNvPicPr/>
                   </pic:nvPicPr>
                   <pic:blipFill>
-                    <a:blip r:embed="rId13"/>
+                    <a:blip r:embed="rId11"/>
                     <a:stretch>
                       <a:fillRect/>
                     </a:stretch>
@@ -5650,117 +4822,78 @@
         </w:rPr>
         <w:t xml:space="preserve"> </w:t>
       </w:r>
-      <w:r>
-        <w:rPr>
+    </w:p>
+    <w:p>
+      <w:pPr>
+        <w:spacing w:after="0" w:line="240" w:lineRule="auto"/>
+        <w:rPr>
+          <w:rFonts w:ascii="Arial" w:eastAsia="Times New Roman" w:hAnsi="Arial" w:cs="Arial"/>
+          <w:color w:val="000000"/>
+          <w:kern w:val="0"/>
+          <w:sz w:val="20"/>
+          <w:szCs w:val="20"/>
+          <w:lang w:eastAsia="es-ES_tradnl"/>
+          <w14:ligatures w14:val="none"/>
+        </w:rPr>
+      </w:pPr>
+      <w:r>
+        <w:rPr>
+          <w:rFonts w:ascii="Arial" w:eastAsia="Times New Roman" w:hAnsi="Arial" w:cs="Arial"/>
+          <w:color w:val="000000"/>
+          <w:kern w:val="0"/>
+          <w:sz w:val="20"/>
+          <w:szCs w:val="20"/>
+          <w:lang w:eastAsia="es-ES_tradnl"/>
+          <w14:ligatures w14:val="none"/>
+        </w:rPr>
+        <w:t xml:space="preserve">Álvaro Baladrón Caballero        Mario Rivas Becerra                </w:t>
+      </w:r>
+    </w:p>
+    <w:p>
+      <w:pPr>
+        <w:spacing w:after="0" w:line="240" w:lineRule="auto"/>
+        <w:rPr>
+          <w:rFonts w:ascii="Arial" w:eastAsia="Times New Roman" w:hAnsi="Arial" w:cs="Arial"/>
+          <w:color w:val="000000"/>
+          <w:kern w:val="0"/>
+          <w:sz w:val="20"/>
+          <w:szCs w:val="20"/>
+          <w:lang w:eastAsia="es-ES_tradnl"/>
+          <w14:ligatures w14:val="none"/>
+        </w:rPr>
+      </w:pPr>
+    </w:p>
+    <w:p>
+      <w:pPr>
+        <w:spacing w:after="0" w:line="240" w:lineRule="auto"/>
+        <w:rPr>
+          <w:rFonts w:ascii="Arial" w:eastAsia="Times New Roman" w:hAnsi="Arial" w:cs="Arial"/>
+          <w:color w:val="000000"/>
+          <w:kern w:val="0"/>
+          <w:sz w:val="20"/>
+          <w:szCs w:val="20"/>
+          <w:lang w:eastAsia="es-ES_tradnl"/>
+          <w14:ligatures w14:val="none"/>
+        </w:rPr>
+      </w:pPr>
+    </w:p>
+    <w:p>
+      <w:pPr>
+        <w:spacing w:after="0" w:line="240" w:lineRule="auto"/>
+        <w:rPr>
+          <w:rFonts w:ascii="Arial" w:eastAsia="Times New Roman" w:hAnsi="Arial" w:cs="Arial"/>
+          <w:color w:val="000000"/>
+          <w:kern w:val="0"/>
+          <w:sz w:val="20"/>
+          <w:szCs w:val="20"/>
+          <w:lang w:eastAsia="es-ES_tradnl"/>
+          <w14:ligatures w14:val="none"/>
+        </w:rPr>
+      </w:pPr>
+      <w:r>
+        <w:rPr>
+          <w:rFonts w:ascii="Arial" w:eastAsia="Times New Roman" w:hAnsi="Arial" w:cs="Arial"/>
           <w:noProof/>
-        </w:rPr>
-        <w:drawing>
-          <wp:inline distT="0" distB="0" distL="0" distR="0" wp14:anchorId="32B05552" wp14:editId="25034753">
-            <wp:extent cx="1763748" cy="1148487"/>
-            <wp:effectExtent l="0" t="0" r="1905" b="0"/>
-            <wp:docPr id="1576913497" name="Imagen 1" descr="Un dibujo de una persona&#10;&#10;El contenido generado por IA puede ser incorrecto."/>
-            <wp:cNvGraphicFramePr>
-              <a:graphicFrameLocks xmlns:a="http://schemas.openxmlformats.org/drawingml/2006/main" noChangeAspect="1"/>
-            </wp:cNvGraphicFramePr>
-            <a:graphic xmlns:a="http://schemas.openxmlformats.org/drawingml/2006/main">
-              <a:graphicData uri="http://schemas.openxmlformats.org/drawingml/2006/picture">
-                <pic:pic xmlns:pic="http://schemas.openxmlformats.org/drawingml/2006/picture">
-                  <pic:nvPicPr>
-                    <pic:cNvPr id="1576913497" name="Imagen 1" descr="Un dibujo de una persona&#10;&#10;El contenido generado por IA puede ser incorrecto."/>
-                    <pic:cNvPicPr/>
-                  </pic:nvPicPr>
-                  <pic:blipFill>
-                    <a:blip r:embed="rId14"/>
-                    <a:stretch>
-                      <a:fillRect/>
-                    </a:stretch>
-                  </pic:blipFill>
-                  <pic:spPr>
-                    <a:xfrm>
-                      <a:off x="0" y="0"/>
-                      <a:ext cx="1794307" cy="1168386"/>
-                    </a:xfrm>
-                    <a:prstGeom prst="rect">
-                      <a:avLst/>
-                    </a:prstGeom>
-                  </pic:spPr>
-                </pic:pic>
-              </a:graphicData>
-            </a:graphic>
-          </wp:inline>
-        </w:drawing>
-      </w:r>
-    </w:p>
-    <w:p>
-      <w:pPr>
-        <w:spacing w:after="0" w:line="240" w:lineRule="auto"/>
-        <w:rPr>
-          <w:rFonts w:ascii="Arial" w:eastAsia="Times New Roman" w:hAnsi="Arial" w:cs="Arial"/>
-          <w:color w:val="000000"/>
-          <w:kern w:val="0"/>
-          <w:sz w:val="20"/>
-          <w:szCs w:val="20"/>
-          <w:lang w:eastAsia="es-ES_tradnl"/>
-          <w14:ligatures w14:val="none"/>
-        </w:rPr>
-      </w:pPr>
-      <w:r>
-        <w:rPr>
-          <w:rFonts w:ascii="Arial" w:eastAsia="Times New Roman" w:hAnsi="Arial" w:cs="Arial"/>
-          <w:color w:val="000000"/>
-          <w:kern w:val="0"/>
-          <w:sz w:val="20"/>
-          <w:szCs w:val="20"/>
-          <w:lang w:eastAsia="es-ES_tradnl"/>
-          <w14:ligatures w14:val="none"/>
-        </w:rPr>
-        <w:t>Álvaro Baladrón Caballero        Mario Rivas Becerra                Jesús Villalba Fernández</w:t>
-      </w:r>
-    </w:p>
-    <w:p>
-      <w:pPr>
-        <w:spacing w:after="0" w:line="240" w:lineRule="auto"/>
-        <w:rPr>
-          <w:rFonts w:ascii="Arial" w:eastAsia="Times New Roman" w:hAnsi="Arial" w:cs="Arial"/>
-          <w:color w:val="000000"/>
-          <w:kern w:val="0"/>
-          <w:sz w:val="20"/>
-          <w:szCs w:val="20"/>
-          <w:lang w:eastAsia="es-ES_tradnl"/>
-          <w14:ligatures w14:val="none"/>
-        </w:rPr>
-      </w:pPr>
-    </w:p>
-    <w:p>
-      <w:pPr>
-        <w:spacing w:after="0" w:line="240" w:lineRule="auto"/>
-        <w:rPr>
-          <w:rFonts w:ascii="Arial" w:eastAsia="Times New Roman" w:hAnsi="Arial" w:cs="Arial"/>
-          <w:color w:val="000000"/>
-          <w:kern w:val="0"/>
-          <w:sz w:val="20"/>
-          <w:szCs w:val="20"/>
-          <w:lang w:eastAsia="es-ES_tradnl"/>
-          <w14:ligatures w14:val="none"/>
-        </w:rPr>
-      </w:pPr>
-    </w:p>
-    <w:p>
-      <w:pPr>
-        <w:spacing w:after="0" w:line="240" w:lineRule="auto"/>
-        <w:rPr>
-          <w:rFonts w:ascii="Arial" w:eastAsia="Times New Roman" w:hAnsi="Arial" w:cs="Arial"/>
-          <w:color w:val="000000"/>
-          <w:kern w:val="0"/>
-          <w:sz w:val="20"/>
-          <w:szCs w:val="20"/>
-          <w:lang w:eastAsia="es-ES_tradnl"/>
-          <w14:ligatures w14:val="none"/>
-        </w:rPr>
-      </w:pPr>
-      <w:r>
-        <w:rPr>
-          <w:rFonts w:ascii="Arial" w:eastAsia="Times New Roman" w:hAnsi="Arial" w:cs="Arial"/>
           <w:color w:val="000000"/>
           <w:kern w:val="0"/>
           <w:sz w:val="20"/>
@@ -5784,7 +4917,7 @@
                     <pic:cNvPicPr/>
                   </pic:nvPicPr>
                   <pic:blipFill>
-                    <a:blip r:embed="rId15"/>
+                    <a:blip r:embed="rId12"/>
                     <a:stretch>
                       <a:fillRect/>
                     </a:stretch>
@@ -5812,45 +4945,26 @@
       </w:r>
       <w:r>
         <w:rPr>
+          <w:rFonts w:ascii="Arial" w:eastAsia="Times New Roman" w:hAnsi="Arial" w:cs="Arial"/>
+          <w:color w:val="000000"/>
+          <w:kern w:val="0"/>
+          <w:sz w:val="20"/>
+          <w:szCs w:val="20"/>
+          <w:lang w:eastAsia="es-ES_tradnl"/>
+          <w14:ligatures w14:val="none"/>
+        </w:rPr>
+        <w:br/>
+      </w:r>
+      <w:r>
+        <w:rPr>
           <w:noProof/>
         </w:rPr>
-        <w:drawing>
-          <wp:inline distT="0" distB="0" distL="0" distR="0" wp14:anchorId="6F0B6345" wp14:editId="64829556">
-            <wp:extent cx="1642595" cy="950976"/>
-            <wp:effectExtent l="0" t="0" r="0" b="1905"/>
-            <wp:docPr id="828060418" name="Imagen 1" descr="Un dibujo de una persona&#10;&#10;El contenido generado por IA puede ser incorrecto."/>
-            <wp:cNvGraphicFramePr>
-              <a:graphicFrameLocks xmlns:a="http://schemas.openxmlformats.org/drawingml/2006/main" noChangeAspect="1"/>
-            </wp:cNvGraphicFramePr>
-            <a:graphic xmlns:a="http://schemas.openxmlformats.org/drawingml/2006/main">
-              <a:graphicData uri="http://schemas.openxmlformats.org/drawingml/2006/picture">
-                <pic:pic xmlns:pic="http://schemas.openxmlformats.org/drawingml/2006/picture">
-                  <pic:nvPicPr>
-                    <pic:cNvPr id="828060418" name="Imagen 1" descr="Un dibujo de una persona&#10;&#10;El contenido generado por IA puede ser incorrecto."/>
-                    <pic:cNvPicPr/>
-                  </pic:nvPicPr>
-                  <pic:blipFill>
-                    <a:blip r:embed="rId16"/>
-                    <a:stretch>
-                      <a:fillRect/>
-                    </a:stretch>
-                  </pic:blipFill>
-                  <pic:spPr>
-                    <a:xfrm>
-                      <a:off x="0" y="0"/>
-                      <a:ext cx="1690962" cy="978978"/>
-                    </a:xfrm>
-                    <a:prstGeom prst="rect">
-                      <a:avLst/>
-                    </a:prstGeom>
-                  </pic:spPr>
-                </pic:pic>
-              </a:graphicData>
-            </a:graphic>
-          </wp:inline>
-        </w:drawing>
-      </w:r>
-      <w:r>
+        <w:t xml:space="preserve"> </w:t>
+      </w:r>
+    </w:p>
+    <w:p>
+      <w:pPr>
+        <w:spacing w:after="0" w:line="240" w:lineRule="auto"/>
         <w:rPr>
           <w:rFonts w:ascii="Arial" w:eastAsia="Times New Roman" w:hAnsi="Arial" w:cs="Arial"/>
           <w:color w:val="000000"/>
@@ -5860,18 +4974,8 @@
           <w:lang w:eastAsia="es-ES_tradnl"/>
           <w14:ligatures w14:val="none"/>
         </w:rPr>
-        <w:br/>
-      </w:r>
-      <w:r>
-        <w:rPr>
-          <w:noProof/>
-        </w:rPr>
-        <w:t xml:space="preserve"> </w:t>
-      </w:r>
-    </w:p>
-    <w:p>
-      <w:pPr>
-        <w:spacing w:after="0" w:line="240" w:lineRule="auto"/>
+      </w:pPr>
+      <w:r>
         <w:rPr>
           <w:rFonts w:ascii="Arial" w:eastAsia="Times New Roman" w:hAnsi="Arial" w:cs="Arial"/>
           <w:color w:val="000000"/>
@@ -5881,18 +4985,7 @@
           <w:lang w:eastAsia="es-ES_tradnl"/>
           <w14:ligatures w14:val="none"/>
         </w:rPr>
-      </w:pPr>
-      <w:r>
-        <w:rPr>
-          <w:rFonts w:ascii="Arial" w:eastAsia="Times New Roman" w:hAnsi="Arial" w:cs="Arial"/>
-          <w:color w:val="000000"/>
-          <w:kern w:val="0"/>
-          <w:sz w:val="20"/>
-          <w:szCs w:val="20"/>
-          <w:lang w:eastAsia="es-ES_tradnl"/>
-          <w14:ligatures w14:val="none"/>
-        </w:rPr>
-        <w:t>Ángel Manuel Ferrer Álvarez           Juan Ramírez Morales</w:t>
+        <w:t xml:space="preserve">Ángel Manuel Ferrer Álvarez          </w:t>
       </w:r>
     </w:p>
     <w:p>
@@ -5935,7 +5028,7 @@
           <w:kern w:val="0"/>
           <w:sz w:val="20"/>
           <w:szCs w:val="20"/>
-          <w:lang w:eastAsia="es-ES_tradnl"/>
+          <w:lang w:val="en-GB" w:eastAsia="es-ES_tradnl"/>
           <w14:ligatures w14:val="none"/>
         </w:rPr>
       </w:pPr>
@@ -5948,7 +5041,7 @@
           <w:kern w:val="0"/>
           <w:sz w:val="20"/>
           <w:szCs w:val="20"/>
-          <w:lang w:eastAsia="es-ES_tradnl"/>
+          <w:lang w:val="en-GB" w:eastAsia="es-ES_tradnl"/>
           <w14:ligatures w14:val="none"/>
         </w:rPr>
         <w:t>12</w:t>
@@ -5962,12 +5055,11 @@
           <w:kern w:val="0"/>
           <w:sz w:val="20"/>
           <w:szCs w:val="20"/>
-          <w:lang w:eastAsia="es-ES_tradnl"/>
-          <w14:ligatures w14:val="none"/>
-        </w:rPr>
-        <w:t xml:space="preserve">. </w:t>
-      </w:r>
-      <w:proofErr w:type="spellStart"/>
+          <w:lang w:val="en-GB" w:eastAsia="es-ES_tradnl"/>
+          <w14:ligatures w14:val="none"/>
+        </w:rPr>
+        <w:t>. Conclusion</w:t>
+      </w:r>
       <w:r>
         <w:rPr>
           <w:rFonts w:ascii="Arial" w:eastAsia="Times New Roman" w:hAnsi="Arial" w:cs="Arial"/>
@@ -5977,73 +5069,67 @@
           <w:kern w:val="0"/>
           <w:sz w:val="20"/>
           <w:szCs w:val="20"/>
-          <w:lang w:eastAsia="es-ES_tradnl"/>
-          <w14:ligatures w14:val="none"/>
-        </w:rPr>
-        <w:t>Conclusion</w:t>
-      </w:r>
-      <w:proofErr w:type="spellEnd"/>
-      <w:r>
-        <w:rPr>
-          <w:rFonts w:ascii="Arial" w:eastAsia="Times New Roman" w:hAnsi="Arial" w:cs="Arial"/>
+          <w:lang w:val="en-GB" w:eastAsia="es-ES_tradnl"/>
+          <w14:ligatures w14:val="none"/>
+        </w:rPr>
+        <w:br/>
+      </w:r>
+    </w:p>
+    <w:p>
+      <w:pPr>
+        <w:rPr>
+          <w:sz w:val="20"/>
+          <w:szCs w:val="20"/>
+          <w:lang w:val="en-US"/>
+        </w:rPr>
+      </w:pPr>
+      <w:r>
+        <w:rPr>
+          <w:sz w:val="20"/>
+          <w:szCs w:val="20"/>
+          <w:lang w:val="en-US"/>
+        </w:rPr>
+        <w:t>This document has defined the criteria for identifying both positive and negative performance within the group throughout the project. It also outlines the corresponding actions to be taken in each case, including the possibility of dismissing a team member in situations of serious underperformance.</w:t>
+      </w:r>
+    </w:p>
+    <w:p>
+      <w:pPr>
+        <w:rPr>
+          <w:sz w:val="20"/>
+          <w:szCs w:val="20"/>
+          <w:lang w:val="en-US"/>
+        </w:rPr>
+      </w:pPr>
+      <w:r>
+        <w:rPr>
+          <w:sz w:val="20"/>
+          <w:szCs w:val="20"/>
+          <w:lang w:val="en-US"/>
+        </w:rPr>
+        <w:t>These measures aim to ensure that the project is carried out as smoothly as possible, minimizing potential conflicts and promoting a collaborative and accountable working environment for all team members.</w:t>
+      </w:r>
+    </w:p>
+    <w:p>
+      <w:pPr>
+        <w:rPr>
+          <w:sz w:val="20"/>
+          <w:szCs w:val="20"/>
+          <w:lang w:val="en-US"/>
+        </w:rPr>
+      </w:pPr>
+    </w:p>
+    <w:p>
+      <w:pPr>
+        <w:ind w:firstLine="708"/>
+        <w:rPr>
           <w:b/>
           <w:bCs/>
-          <w:color w:val="000000"/>
-          <w:kern w:val="0"/>
-          <w:sz w:val="20"/>
-          <w:szCs w:val="20"/>
-          <w:lang w:eastAsia="es-ES_tradnl"/>
-          <w14:ligatures w14:val="none"/>
-        </w:rPr>
-        <w:br/>
-      </w:r>
-    </w:p>
-    <w:p>
-      <w:pPr>
-        <w:rPr>
-          <w:sz w:val="20"/>
-          <w:szCs w:val="20"/>
-          <w:lang w:val="en-US"/>
-        </w:rPr>
-      </w:pPr>
-      <w:r>
-        <w:rPr>
-          <w:sz w:val="20"/>
-          <w:szCs w:val="20"/>
-          <w:lang w:val="en-US"/>
-        </w:rPr>
-        <w:t>This document has defined the criteria for identifying both positive and negative performance within the group throughout the project. It also outlines the corresponding actions to be taken in each case, including the possibility of dismissing a team member in situations of serious underperformance.</w:t>
-      </w:r>
-    </w:p>
-    <w:p>
-      <w:pPr>
-        <w:rPr>
-          <w:sz w:val="20"/>
-          <w:szCs w:val="20"/>
-          <w:lang w:val="en-US"/>
-        </w:rPr>
-      </w:pPr>
-      <w:r>
-        <w:rPr>
-          <w:sz w:val="20"/>
-          <w:szCs w:val="20"/>
-          <w:lang w:val="en-US"/>
-        </w:rPr>
-        <w:t>These measures aim to ensure that the project is carried out as smoothly as possible, minimizing potential conflicts and promoting a collaborative and accountable working environment for all team members.</w:t>
-      </w:r>
-    </w:p>
-    <w:p>
-      <w:pPr>
-        <w:rPr>
-          <w:sz w:val="20"/>
-          <w:szCs w:val="20"/>
-          <w:lang w:val="en-US"/>
-        </w:rPr>
-      </w:pPr>
-    </w:p>
-    <w:p>
-      <w:pPr>
-        <w:ind w:firstLine="708"/>
+          <w:sz w:val="20"/>
+          <w:szCs w:val="20"/>
+          <w:lang w:val="en-US"/>
+        </w:rPr>
+      </w:pPr>
+      <w:r>
         <w:rPr>
           <w:b/>
           <w:bCs/>
@@ -6051,7 +5137,8 @@
           <w:szCs w:val="20"/>
           <w:lang w:val="en-US"/>
         </w:rPr>
-      </w:pPr>
+        <w:t>13</w:t>
+      </w:r>
       <w:r>
         <w:rPr>
           <w:b/>
@@ -6060,9 +5147,11 @@
           <w:szCs w:val="20"/>
           <w:lang w:val="en-US"/>
         </w:rPr>
-        <w:t>13</w:t>
-      </w:r>
-      <w:r>
+        <w:t>. Bibliography</w:t>
+      </w:r>
+    </w:p>
+    <w:p>
+      <w:pPr>
         <w:rPr>
           <w:b/>
           <w:bCs/>
@@ -6070,55 +5159,15 @@
           <w:szCs w:val="20"/>
           <w:lang w:val="en-US"/>
         </w:rPr>
-        <w:t>. Bibliography</w:t>
-      </w:r>
-    </w:p>
-    <w:p>
-      <w:pPr>
-        <w:rPr>
-          <w:b/>
-          <w:bCs/>
-          <w:sz w:val="20"/>
-          <w:szCs w:val="20"/>
-          <w:lang w:val="en-US"/>
-        </w:rPr>
-      </w:pPr>
-      <w:proofErr w:type="spellStart"/>
+      </w:pPr>
       <w:r>
         <w:rPr>
           <w:rFonts w:asciiTheme="majorHAnsi" w:hAnsiTheme="majorHAnsi" w:cstheme="majorHAnsi"/>
           <w:sz w:val="20"/>
           <w:szCs w:val="20"/>
         </w:rPr>
-        <w:t>I</w:t>
-      </w:r>
-      <w:r>
-        <w:rPr>
-          <w:rFonts w:asciiTheme="majorHAnsi" w:hAnsiTheme="majorHAnsi" w:cstheme="majorHAnsi"/>
-          <w:sz w:val="20"/>
-          <w:szCs w:val="20"/>
-        </w:rPr>
-        <w:t>ntentionally</w:t>
-      </w:r>
-      <w:proofErr w:type="spellEnd"/>
-      <w:r>
-        <w:rPr>
-          <w:rFonts w:asciiTheme="majorHAnsi" w:hAnsiTheme="majorHAnsi" w:cstheme="majorHAnsi"/>
-          <w:sz w:val="20"/>
-          <w:szCs w:val="20"/>
-        </w:rPr>
-        <w:t xml:space="preserve"> </w:t>
-      </w:r>
-      <w:proofErr w:type="spellStart"/>
-      <w:r>
-        <w:rPr>
-          <w:rFonts w:asciiTheme="majorHAnsi" w:hAnsiTheme="majorHAnsi" w:cstheme="majorHAnsi"/>
-          <w:sz w:val="20"/>
-          <w:szCs w:val="20"/>
-        </w:rPr>
-        <w:t>blank</w:t>
-      </w:r>
-      <w:proofErr w:type="spellEnd"/>
+        <w:t>Intentionally blank</w:t>
+      </w:r>
     </w:p>
     <w:sectPr>
       <w:pgSz w:w="11906" w:h="16838"/>
@@ -7751,11 +6800,11 @@
     <w:name w:val="Normal"/>
     <w:qFormat/>
   </w:style>
-  <w:style w:type="paragraph" w:styleId="Ttulo1">
+  <w:style w:type="paragraph" w:styleId="Heading1">
     <w:name w:val="heading 1"/>
     <w:basedOn w:val="Normal"/>
     <w:next w:val="Normal"/>
-    <w:link w:val="Ttulo1Car"/>
+    <w:link w:val="Heading1Char"/>
     <w:uiPriority w:val="9"/>
     <w:qFormat/>
     <w:rsid w:val="006001C1"/>
@@ -7772,11 +6821,11 @@
       <w:szCs w:val="40"/>
     </w:rPr>
   </w:style>
-  <w:style w:type="paragraph" w:styleId="Ttulo2">
+  <w:style w:type="paragraph" w:styleId="Heading2">
     <w:name w:val="heading 2"/>
     <w:basedOn w:val="Normal"/>
     <w:next w:val="Normal"/>
-    <w:link w:val="Ttulo2Car"/>
+    <w:link w:val="Heading2Char"/>
     <w:uiPriority w:val="9"/>
     <w:unhideWhenUsed/>
     <w:qFormat/>
@@ -7794,11 +6843,11 @@
       <w:szCs w:val="32"/>
     </w:rPr>
   </w:style>
-  <w:style w:type="paragraph" w:styleId="Ttulo3">
+  <w:style w:type="paragraph" w:styleId="Heading3">
     <w:name w:val="heading 3"/>
     <w:basedOn w:val="Normal"/>
     <w:next w:val="Normal"/>
-    <w:link w:val="Ttulo3Car"/>
+    <w:link w:val="Heading3Char"/>
     <w:uiPriority w:val="9"/>
     <w:semiHidden/>
     <w:unhideWhenUsed/>
@@ -7817,11 +6866,11 @@
       <w:szCs w:val="28"/>
     </w:rPr>
   </w:style>
-  <w:style w:type="paragraph" w:styleId="Ttulo4">
+  <w:style w:type="paragraph" w:styleId="Heading4">
     <w:name w:val="heading 4"/>
     <w:basedOn w:val="Normal"/>
     <w:next w:val="Normal"/>
-    <w:link w:val="Ttulo4Car"/>
+    <w:link w:val="Heading4Char"/>
     <w:uiPriority w:val="9"/>
     <w:semiHidden/>
     <w:unhideWhenUsed/>
@@ -7840,11 +6889,11 @@
       <w:color w:val="0F4761" w:themeColor="accent1" w:themeShade="BF"/>
     </w:rPr>
   </w:style>
-  <w:style w:type="paragraph" w:styleId="Ttulo5">
+  <w:style w:type="paragraph" w:styleId="Heading5">
     <w:name w:val="heading 5"/>
     <w:basedOn w:val="Normal"/>
     <w:next w:val="Normal"/>
-    <w:link w:val="Ttulo5Car"/>
+    <w:link w:val="Heading5Char"/>
     <w:uiPriority w:val="9"/>
     <w:semiHidden/>
     <w:unhideWhenUsed/>
@@ -7861,11 +6910,11 @@
       <w:color w:val="0F4761" w:themeColor="accent1" w:themeShade="BF"/>
     </w:rPr>
   </w:style>
-  <w:style w:type="paragraph" w:styleId="Ttulo6">
+  <w:style w:type="paragraph" w:styleId="Heading6">
     <w:name w:val="heading 6"/>
     <w:basedOn w:val="Normal"/>
     <w:next w:val="Normal"/>
-    <w:link w:val="Ttulo6Car"/>
+    <w:link w:val="Heading6Char"/>
     <w:uiPriority w:val="9"/>
     <w:semiHidden/>
     <w:unhideWhenUsed/>
@@ -7884,11 +6933,11 @@
       <w:color w:val="595959" w:themeColor="text1" w:themeTint="A6"/>
     </w:rPr>
   </w:style>
-  <w:style w:type="paragraph" w:styleId="Ttulo7">
+  <w:style w:type="paragraph" w:styleId="Heading7">
     <w:name w:val="heading 7"/>
     <w:basedOn w:val="Normal"/>
     <w:next w:val="Normal"/>
-    <w:link w:val="Ttulo7Car"/>
+    <w:link w:val="Heading7Char"/>
     <w:uiPriority w:val="9"/>
     <w:semiHidden/>
     <w:unhideWhenUsed/>
@@ -7905,11 +6954,11 @@
       <w:color w:val="595959" w:themeColor="text1" w:themeTint="A6"/>
     </w:rPr>
   </w:style>
-  <w:style w:type="paragraph" w:styleId="Ttulo8">
+  <w:style w:type="paragraph" w:styleId="Heading8">
     <w:name w:val="heading 8"/>
     <w:basedOn w:val="Normal"/>
     <w:next w:val="Normal"/>
-    <w:link w:val="Ttulo8Car"/>
+    <w:link w:val="Heading8Char"/>
     <w:uiPriority w:val="9"/>
     <w:semiHidden/>
     <w:unhideWhenUsed/>
@@ -7928,11 +6977,11 @@
       <w:color w:val="272727" w:themeColor="text1" w:themeTint="D8"/>
     </w:rPr>
   </w:style>
-  <w:style w:type="paragraph" w:styleId="Ttulo9">
+  <w:style w:type="paragraph" w:styleId="Heading9">
     <w:name w:val="heading 9"/>
     <w:basedOn w:val="Normal"/>
     <w:next w:val="Normal"/>
-    <w:link w:val="Ttulo9Car"/>
+    <w:link w:val="Heading9Char"/>
     <w:uiPriority w:val="9"/>
     <w:semiHidden/>
     <w:unhideWhenUsed/>
@@ -7949,12 +6998,13 @@
       <w:color w:val="272727" w:themeColor="text1" w:themeTint="D8"/>
     </w:rPr>
   </w:style>
-  <w:style w:type="character" w:default="1" w:styleId="Fuentedeprrafopredeter">
+  <w:style w:type="character" w:default="1" w:styleId="DefaultParagraphFont">
     <w:name w:val="Default Paragraph Font"/>
     <w:uiPriority w:val="1"/>
+    <w:semiHidden/>
     <w:unhideWhenUsed/>
   </w:style>
-  <w:style w:type="table" w:default="1" w:styleId="Tablanormal">
+  <w:style w:type="table" w:default="1" w:styleId="TableNormal">
     <w:name w:val="Normal Table"/>
     <w:uiPriority w:val="99"/>
     <w:semiHidden/>
@@ -7969,16 +7019,16 @@
       </w:tblCellMar>
     </w:tblPr>
   </w:style>
-  <w:style w:type="numbering" w:default="1" w:styleId="Sinlista">
+  <w:style w:type="numbering" w:default="1" w:styleId="NoList">
     <w:name w:val="No List"/>
     <w:uiPriority w:val="99"/>
     <w:semiHidden/>
     <w:unhideWhenUsed/>
   </w:style>
-  <w:style w:type="character" w:customStyle="1" w:styleId="Ttulo1Car">
-    <w:name w:val="Título 1 Car"/>
-    <w:basedOn w:val="Fuentedeprrafopredeter"/>
-    <w:link w:val="Ttulo1"/>
+  <w:style w:type="character" w:customStyle="1" w:styleId="Heading1Char">
+    <w:name w:val="Heading 1 Char"/>
+    <w:basedOn w:val="DefaultParagraphFont"/>
+    <w:link w:val="Heading1"/>
     <w:uiPriority w:val="9"/>
     <w:rsid w:val="006001C1"/>
     <w:rPr>
@@ -7988,10 +7038,10 @@
       <w:szCs w:val="40"/>
     </w:rPr>
   </w:style>
-  <w:style w:type="character" w:customStyle="1" w:styleId="Ttulo2Car">
-    <w:name w:val="Título 2 Car"/>
-    <w:basedOn w:val="Fuentedeprrafopredeter"/>
-    <w:link w:val="Ttulo2"/>
+  <w:style w:type="character" w:customStyle="1" w:styleId="Heading2Char">
+    <w:name w:val="Heading 2 Char"/>
+    <w:basedOn w:val="DefaultParagraphFont"/>
+    <w:link w:val="Heading2"/>
     <w:uiPriority w:val="9"/>
     <w:rsid w:val="006001C1"/>
     <w:rPr>
@@ -8001,10 +7051,10 @@
       <w:szCs w:val="32"/>
     </w:rPr>
   </w:style>
-  <w:style w:type="character" w:customStyle="1" w:styleId="Ttulo3Car">
-    <w:name w:val="Título 3 Car"/>
-    <w:basedOn w:val="Fuentedeprrafopredeter"/>
-    <w:link w:val="Ttulo3"/>
+  <w:style w:type="character" w:customStyle="1" w:styleId="Heading3Char">
+    <w:name w:val="Heading 3 Char"/>
+    <w:basedOn w:val="DefaultParagraphFont"/>
+    <w:link w:val="Heading3"/>
     <w:uiPriority w:val="9"/>
     <w:semiHidden/>
     <w:rsid w:val="006001C1"/>
@@ -8015,10 +7065,10 @@
       <w:szCs w:val="28"/>
     </w:rPr>
   </w:style>
-  <w:style w:type="character" w:customStyle="1" w:styleId="Ttulo4Car">
-    <w:name w:val="Título 4 Car"/>
-    <w:basedOn w:val="Fuentedeprrafopredeter"/>
-    <w:link w:val="Ttulo4"/>
+  <w:style w:type="character" w:customStyle="1" w:styleId="Heading4Char">
+    <w:name w:val="Heading 4 Char"/>
+    <w:basedOn w:val="DefaultParagraphFont"/>
+    <w:link w:val="Heading4"/>
     <w:uiPriority w:val="9"/>
     <w:semiHidden/>
     <w:rsid w:val="006001C1"/>
@@ -8029,10 +7079,10 @@
       <w:color w:val="0F4761" w:themeColor="accent1" w:themeShade="BF"/>
     </w:rPr>
   </w:style>
-  <w:style w:type="character" w:customStyle="1" w:styleId="Ttulo5Car">
-    <w:name w:val="Título 5 Car"/>
-    <w:basedOn w:val="Fuentedeprrafopredeter"/>
-    <w:link w:val="Ttulo5"/>
+  <w:style w:type="character" w:customStyle="1" w:styleId="Heading5Char">
+    <w:name w:val="Heading 5 Char"/>
+    <w:basedOn w:val="DefaultParagraphFont"/>
+    <w:link w:val="Heading5"/>
     <w:uiPriority w:val="9"/>
     <w:semiHidden/>
     <w:rsid w:val="006001C1"/>
@@ -8041,10 +7091,10 @@
       <w:color w:val="0F4761" w:themeColor="accent1" w:themeShade="BF"/>
     </w:rPr>
   </w:style>
-  <w:style w:type="character" w:customStyle="1" w:styleId="Ttulo6Car">
-    <w:name w:val="Título 6 Car"/>
-    <w:basedOn w:val="Fuentedeprrafopredeter"/>
-    <w:link w:val="Ttulo6"/>
+  <w:style w:type="character" w:customStyle="1" w:styleId="Heading6Char">
+    <w:name w:val="Heading 6 Char"/>
+    <w:basedOn w:val="DefaultParagraphFont"/>
+    <w:link w:val="Heading6"/>
     <w:uiPriority w:val="9"/>
     <w:semiHidden/>
     <w:rsid w:val="006001C1"/>
@@ -8055,10 +7105,10 @@
       <w:color w:val="595959" w:themeColor="text1" w:themeTint="A6"/>
     </w:rPr>
   </w:style>
-  <w:style w:type="character" w:customStyle="1" w:styleId="Ttulo7Car">
-    <w:name w:val="Título 7 Car"/>
-    <w:basedOn w:val="Fuentedeprrafopredeter"/>
-    <w:link w:val="Ttulo7"/>
+  <w:style w:type="character" w:customStyle="1" w:styleId="Heading7Char">
+    <w:name w:val="Heading 7 Char"/>
+    <w:basedOn w:val="DefaultParagraphFont"/>
+    <w:link w:val="Heading7"/>
     <w:uiPriority w:val="9"/>
     <w:semiHidden/>
     <w:rsid w:val="006001C1"/>
@@ -8067,10 +7117,10 @@
       <w:color w:val="595959" w:themeColor="text1" w:themeTint="A6"/>
     </w:rPr>
   </w:style>
-  <w:style w:type="character" w:customStyle="1" w:styleId="Ttulo8Car">
-    <w:name w:val="Título 8 Car"/>
-    <w:basedOn w:val="Fuentedeprrafopredeter"/>
-    <w:link w:val="Ttulo8"/>
+  <w:style w:type="character" w:customStyle="1" w:styleId="Heading8Char">
+    <w:name w:val="Heading 8 Char"/>
+    <w:basedOn w:val="DefaultParagraphFont"/>
+    <w:link w:val="Heading8"/>
     <w:uiPriority w:val="9"/>
     <w:semiHidden/>
     <w:rsid w:val="006001C1"/>
@@ -8081,10 +7131,10 @@
       <w:color w:val="272727" w:themeColor="text1" w:themeTint="D8"/>
     </w:rPr>
   </w:style>
-  <w:style w:type="character" w:customStyle="1" w:styleId="Ttulo9Car">
-    <w:name w:val="Título 9 Car"/>
-    <w:basedOn w:val="Fuentedeprrafopredeter"/>
-    <w:link w:val="Ttulo9"/>
+  <w:style w:type="character" w:customStyle="1" w:styleId="Heading9Char">
+    <w:name w:val="Heading 9 Char"/>
+    <w:basedOn w:val="DefaultParagraphFont"/>
+    <w:link w:val="Heading9"/>
     <w:uiPriority w:val="9"/>
     <w:semiHidden/>
     <w:rsid w:val="006001C1"/>
@@ -8093,11 +7143,11 @@
       <w:color w:val="272727" w:themeColor="text1" w:themeTint="D8"/>
     </w:rPr>
   </w:style>
-  <w:style w:type="paragraph" w:styleId="Ttulo">
+  <w:style w:type="paragraph" w:styleId="Title">
     <w:name w:val="Title"/>
     <w:basedOn w:val="Normal"/>
     <w:next w:val="Normal"/>
-    <w:link w:val="TtuloCar"/>
+    <w:link w:val="TitleChar"/>
     <w:uiPriority w:val="10"/>
     <w:qFormat/>
     <w:rsid w:val="006001C1"/>
@@ -8113,10 +7163,10 @@
       <w:szCs w:val="56"/>
     </w:rPr>
   </w:style>
-  <w:style w:type="character" w:customStyle="1" w:styleId="TtuloCar">
-    <w:name w:val="Título Car"/>
-    <w:basedOn w:val="Fuentedeprrafopredeter"/>
-    <w:link w:val="Ttulo"/>
+  <w:style w:type="character" w:customStyle="1" w:styleId="TitleChar">
+    <w:name w:val="Title Char"/>
+    <w:basedOn w:val="DefaultParagraphFont"/>
+    <w:link w:val="Title"/>
     <w:uiPriority w:val="10"/>
     <w:rsid w:val="006001C1"/>
     <w:rPr>
@@ -8127,11 +7177,11 @@
       <w:szCs w:val="56"/>
     </w:rPr>
   </w:style>
-  <w:style w:type="paragraph" w:styleId="Subttulo">
+  <w:style w:type="paragraph" w:styleId="Subtitle">
     <w:name w:val="Subtitle"/>
     <w:basedOn w:val="Normal"/>
     <w:next w:val="Normal"/>
-    <w:link w:val="SubttuloCar"/>
+    <w:link w:val="SubtitleChar"/>
     <w:uiPriority w:val="11"/>
     <w:qFormat/>
     <w:rsid w:val="006001C1"/>
@@ -8148,10 +7198,10 @@
       <w:szCs w:val="28"/>
     </w:rPr>
   </w:style>
-  <w:style w:type="character" w:customStyle="1" w:styleId="SubttuloCar">
-    <w:name w:val="Subtítulo Car"/>
-    <w:basedOn w:val="Fuentedeprrafopredeter"/>
-    <w:link w:val="Subttulo"/>
+  <w:style w:type="character" w:customStyle="1" w:styleId="SubtitleChar">
+    <w:name w:val="Subtitle Char"/>
+    <w:basedOn w:val="DefaultParagraphFont"/>
+    <w:link w:val="Subtitle"/>
     <w:uiPriority w:val="11"/>
     <w:rsid w:val="006001C1"/>
     <w:rPr>
@@ -8162,11 +7212,11 @@
       <w:szCs w:val="28"/>
     </w:rPr>
   </w:style>
-  <w:style w:type="paragraph" w:styleId="Cita">
+  <w:style w:type="paragraph" w:styleId="Quote">
     <w:name w:val="Quote"/>
     <w:basedOn w:val="Normal"/>
     <w:next w:val="Normal"/>
-    <w:link w:val="CitaCar"/>
+    <w:link w:val="QuoteChar"/>
     <w:uiPriority w:val="29"/>
     <w:qFormat/>
     <w:rsid w:val="006001C1"/>
@@ -8180,10 +7230,10 @@
       <w:color w:val="404040" w:themeColor="text1" w:themeTint="BF"/>
     </w:rPr>
   </w:style>
-  <w:style w:type="character" w:customStyle="1" w:styleId="CitaCar">
-    <w:name w:val="Cita Car"/>
-    <w:basedOn w:val="Fuentedeprrafopredeter"/>
-    <w:link w:val="Cita"/>
+  <w:style w:type="character" w:customStyle="1" w:styleId="QuoteChar">
+    <w:name w:val="Quote Char"/>
+    <w:basedOn w:val="DefaultParagraphFont"/>
+    <w:link w:val="Quote"/>
     <w:uiPriority w:val="29"/>
     <w:rsid w:val="006001C1"/>
     <w:rPr>
@@ -8192,7 +7242,7 @@
       <w:color w:val="404040" w:themeColor="text1" w:themeTint="BF"/>
     </w:rPr>
   </w:style>
-  <w:style w:type="paragraph" w:styleId="Prrafodelista">
+  <w:style w:type="paragraph" w:styleId="ListParagraph">
     <w:name w:val="List Paragraph"/>
     <w:basedOn w:val="Normal"/>
     <w:uiPriority w:val="34"/>
@@ -8203,9 +7253,9 @@
       <w:contextualSpacing/>
     </w:pPr>
   </w:style>
-  <w:style w:type="character" w:styleId="nfasisintenso">
+  <w:style w:type="character" w:styleId="IntenseEmphasis">
     <w:name w:val="Intense Emphasis"/>
-    <w:basedOn w:val="Fuentedeprrafopredeter"/>
+    <w:basedOn w:val="DefaultParagraphFont"/>
     <w:uiPriority w:val="21"/>
     <w:qFormat/>
     <w:rsid w:val="006001C1"/>
@@ -8215,11 +7265,11 @@
       <w:color w:val="0F4761" w:themeColor="accent1" w:themeShade="BF"/>
     </w:rPr>
   </w:style>
-  <w:style w:type="paragraph" w:styleId="Citadestacada">
+  <w:style w:type="paragraph" w:styleId="IntenseQuote">
     <w:name w:val="Intense Quote"/>
     <w:basedOn w:val="Normal"/>
     <w:next w:val="Normal"/>
-    <w:link w:val="CitadestacadaCar"/>
+    <w:link w:val="IntenseQuoteChar"/>
     <w:uiPriority w:val="30"/>
     <w:qFormat/>
     <w:rsid w:val="006001C1"/>
@@ -8238,10 +7288,10 @@
       <w:color w:val="0F4761" w:themeColor="accent1" w:themeShade="BF"/>
     </w:rPr>
   </w:style>
-  <w:style w:type="character" w:customStyle="1" w:styleId="CitadestacadaCar">
-    <w:name w:val="Cita destacada Car"/>
-    <w:basedOn w:val="Fuentedeprrafopredeter"/>
-    <w:link w:val="Citadestacada"/>
+  <w:style w:type="character" w:customStyle="1" w:styleId="IntenseQuoteChar">
+    <w:name w:val="Intense Quote Char"/>
+    <w:basedOn w:val="DefaultParagraphFont"/>
+    <w:link w:val="IntenseQuote"/>
     <w:uiPriority w:val="30"/>
     <w:rsid w:val="006001C1"/>
     <w:rPr>
@@ -8250,9 +7300,9 @@
       <w:color w:val="0F4761" w:themeColor="accent1" w:themeShade="BF"/>
     </w:rPr>
   </w:style>
-  <w:style w:type="character" w:styleId="Referenciaintensa">
+  <w:style w:type="character" w:styleId="IntenseReference">
     <w:name w:val="Intense Reference"/>
-    <w:basedOn w:val="Fuentedeprrafopredeter"/>
+    <w:basedOn w:val="DefaultParagraphFont"/>
     <w:uiPriority w:val="32"/>
     <w:qFormat/>
     <w:rsid w:val="006001C1"/>
@@ -8281,9 +7331,9 @@
       <w14:ligatures w14:val="none"/>
     </w:rPr>
   </w:style>
-  <w:style w:type="character" w:styleId="Hipervnculo">
+  <w:style w:type="character" w:styleId="Hyperlink">
     <w:name w:val="Hyperlink"/>
-    <w:basedOn w:val="Fuentedeprrafopredeter"/>
+    <w:basedOn w:val="DefaultParagraphFont"/>
     <w:uiPriority w:val="99"/>
     <w:semiHidden/>
     <w:unhideWhenUsed/>
@@ -8309,7 +7359,7 @@
   </w:style>
   <w:style w:type="character" w:customStyle="1" w:styleId="s1">
     <w:name w:val="s1"/>
-    <w:basedOn w:val="Fuentedeprrafopredeter"/>
+    <w:basedOn w:val="DefaultParagraphFont"/>
     <w:rsid w:val="006001C1"/>
   </w:style>
   <w:style w:type="paragraph" w:customStyle="1" w:styleId="p2">
@@ -8328,7 +7378,7 @@
   </w:style>
   <w:style w:type="character" w:customStyle="1" w:styleId="s2">
     <w:name w:val="s2"/>
-    <w:basedOn w:val="Fuentedeprrafopredeter"/>
+    <w:basedOn w:val="DefaultParagraphFont"/>
     <w:rsid w:val="006001C1"/>
   </w:style>
   <w:style w:type="paragraph" w:customStyle="1" w:styleId="p4">
@@ -8345,9 +7395,9 @@
       <w14:ligatures w14:val="none"/>
     </w:rPr>
   </w:style>
-  <w:style w:type="table" w:styleId="Tablaconcuadrcula">
+  <w:style w:type="table" w:styleId="TableGrid">
     <w:name w:val="Table Grid"/>
-    <w:basedOn w:val="Tablanormal"/>
+    <w:basedOn w:val="TableNormal"/>
     <w:uiPriority w:val="39"/>
     <w:rsid w:val="008554B1"/>
     <w:pPr>

</xml_diff>